<commit_message>
Add Lab2 dashboard, tasks and assets
Add Lab2 deliverables: Dashboard (index.html, style.css, admin.jpg), Task1 and Task2 pages with their CSS, and a PDF submission. Update MaryamJahangir_241949_FSWD_Lab2.docx and remove the temporary ~ file. Dashboard uses Bootstrap and custom styles; task pages are team showcase examples.
</commit_message>
<xml_diff>
--- a/Lab2/MaryamJahangir_241949_FSWD_Lab2.docx
+++ b/Lab2/MaryamJahangir_241949_FSWD_Lab2.docx
@@ -2,8 +2,329 @@
 <file path=word/document.xml><?xml version="1.0" encoding="utf-8"?>
 <w:document xmlns:wpc="http://schemas.microsoft.com/office/word/2010/wordprocessingCanvas" xmlns:cx="http://schemas.microsoft.com/office/drawing/2014/chartex" xmlns:cx1="http://schemas.microsoft.com/office/drawing/2015/9/8/chartex" xmlns:cx2="http://schemas.microsoft.com/office/drawing/2015/10/21/chartex" xmlns:cx3="http://schemas.microsoft.com/office/drawing/2016/5/9/chartex" xmlns:cx4="http://schemas.microsoft.com/office/drawing/2016/5/10/chartex" xmlns:cx5="http://schemas.microsoft.com/office/drawing/2016/5/11/chartex" xmlns:cx6="http://schemas.microsoft.com/office/drawing/2016/5/12/chartex" xmlns:cx7="http://schemas.microsoft.com/office/drawing/2016/5/13/chartex" xmlns:cx8="http://schemas.microsoft.com/office/drawing/2016/5/14/chartex" xmlns:mc="http://schemas.openxmlformats.org/markup-compatibility/2006" xmlns:aink="http://schemas.microsoft.com/office/drawing/2016/ink" xmlns:am3d="http://schemas.microsoft.com/office/drawing/2017/model3d" xmlns:o="urn:schemas-microsoft-com:office:office" xmlns:oel="http://schemas.microsoft.com/office/2019/extlst" xmlns:r="http://schemas.openxmlformats.org/officeDocument/2006/relationships" xmlns:m="http://schemas.openxmlformats.org/officeDocument/2006/math" xmlns:v="urn:schemas-microsoft-com:vml" xmlns:wp14="http://schemas.microsoft.com/office/word/2010/wordprocessingDrawing" xmlns:wp="http://schemas.openxmlformats.org/drawingml/2006/wordprocessingDrawing" xmlns:w10="urn:schemas-microsoft-com:office:word" xmlns:w="http://schemas.openxmlformats.org/wordprocessingml/2006/main" xmlns:w14="http://schemas.microsoft.com/office/word/2010/wordml" xmlns:w15="http://schemas.microsoft.com/office/word/2012/wordml" xmlns:w16cex="http://schemas.microsoft.com/office/word/2018/wordml/cex" xmlns:w16cid="http://schemas.microsoft.com/office/word/2016/wordml/cid" xmlns:w16="http://schemas.microsoft.com/office/word/2018/wordml" xmlns:w16du="http://schemas.microsoft.com/office/word/2023/wordml/word16du" xmlns:w16sdtdh="http://schemas.microsoft.com/office/word/2020/wordml/sdtdatahash" xmlns:w16sdtfl="http://schemas.microsoft.com/office/word/2024/wordml/sdtformatlock" xmlns:w16se="http://schemas.microsoft.com/office/word/2015/wordml/symex" xmlns:wpg="http://schemas.microsoft.com/office/word/2010/wordprocessingGroup" xmlns:wpi="http://schemas.microsoft.com/office/word/2010/wordprocessingInk" xmlns:wne="http://schemas.microsoft.com/office/word/2006/wordml" xmlns:wps="http://schemas.microsoft.com/office/word/2010/wordprocessingShape" mc:Ignorable="w14 w15 w16se w16cid w16 w16cex w16sdtdh w16sdtfl w16du wp14">
   <w:body>
-    <w:p>
-      <w:r>
+    <w:sdt>
+      <w:sdtPr>
+        <w:rPr>
+          <w:color w:val="4472C4" w:themeColor="accent1"/>
+        </w:rPr>
+        <w:id w:val="-710648197"/>
+        <w:docPartObj>
+          <w:docPartGallery w:val="Cover Pages"/>
+          <w:docPartUnique/>
+        </w:docPartObj>
+      </w:sdtPr>
+      <w:sdtEndPr>
+        <w:rPr>
+          <w:color w:val="auto"/>
+          <w:kern w:val="2"/>
+          <w:lang w:val="en-PK" w:eastAsia="zh-CN"/>
+          <w14:ligatures w14:val="standardContextual"/>
+        </w:rPr>
+      </w:sdtEndPr>
+      <w:sdtContent>
+        <w:p>
+          <w:pPr>
+            <w:pStyle w:val="NoSpacing"/>
+            <w:spacing w:before="1540" w:after="240"/>
+            <w:jc w:val="center"/>
+            <w:rPr>
+              <w:color w:val="4472C4" w:themeColor="accent1"/>
+            </w:rPr>
+          </w:pPr>
+          <w:r>
+            <w:rPr>
+              <w:noProof/>
+              <w:color w:val="4472C4" w:themeColor="accent1"/>
+            </w:rPr>
+            <w:drawing>
+              <wp:inline distT="0" distB="0" distL="0" distR="0" wp14:anchorId="113C99A0" wp14:editId="5CDE393C">
+                <wp:extent cx="1417320" cy="750898"/>
+                <wp:effectExtent l="0" t="0" r="0" b="0"/>
+                <wp:docPr id="143" name="Picture 144"/>
+                <wp:cNvGraphicFramePr>
+                  <a:graphicFrameLocks xmlns:a="http://schemas.openxmlformats.org/drawingml/2006/main" noChangeAspect="1"/>
+                </wp:cNvGraphicFramePr>
+                <a:graphic xmlns:a="http://schemas.openxmlformats.org/drawingml/2006/main">
+                  <a:graphicData uri="http://schemas.openxmlformats.org/drawingml/2006/picture">
+                    <pic:pic xmlns:pic="http://schemas.openxmlformats.org/drawingml/2006/picture">
+                      <pic:nvPicPr>
+                        <pic:cNvPr id="3" name="t55.png"/>
+                        <pic:cNvPicPr/>
+                      </pic:nvPicPr>
+                      <pic:blipFill>
+                        <a:blip r:embed="rId5" cstate="print">
+                          <a:duotone>
+                            <a:schemeClr val="accent1">
+                              <a:shade val="45000"/>
+                              <a:satMod val="135000"/>
+                            </a:schemeClr>
+                            <a:prstClr val="white"/>
+                          </a:duotone>
+                          <a:extLst>
+                            <a:ext uri="{28A0092B-C50C-407E-A947-70E740481C1C}">
+                              <a14:useLocalDpi xmlns:a14="http://schemas.microsoft.com/office/drawing/2010/main" val="0"/>
+                            </a:ext>
+                          </a:extLst>
+                        </a:blip>
+                        <a:stretch>
+                          <a:fillRect/>
+                        </a:stretch>
+                      </pic:blipFill>
+                      <pic:spPr>
+                        <a:xfrm>
+                          <a:off x="0" y="0"/>
+                          <a:ext cx="1417320" cy="750898"/>
+                        </a:xfrm>
+                        <a:prstGeom prst="rect">
+                          <a:avLst/>
+                        </a:prstGeom>
+                        <a:noFill/>
+                        <a:ln>
+                          <a:noFill/>
+                        </a:ln>
+                      </pic:spPr>
+                    </pic:pic>
+                  </a:graphicData>
+                </a:graphic>
+              </wp:inline>
+            </w:drawing>
+          </w:r>
+        </w:p>
+        <w:sdt>
+          <w:sdtPr>
+            <w:rPr>
+              <w:rFonts w:asciiTheme="majorHAnsi" w:eastAsiaTheme="majorEastAsia" w:hAnsiTheme="majorHAnsi" w:cstheme="majorBidi"/>
+              <w:caps/>
+              <w:color w:val="4472C4" w:themeColor="accent1"/>
+              <w:sz w:val="72"/>
+              <w:szCs w:val="72"/>
+            </w:rPr>
+            <w:alias w:val="Title"/>
+            <w:tag w:val=""/>
+            <w:id w:val="1735040861"/>
+            <w:placeholder>
+              <w:docPart w:val="35EDE1D46D77471FAF011BAF829EAD7C"/>
+            </w:placeholder>
+            <w:dataBinding w:prefixMappings="xmlns:ns0='http://purl.org/dc/elements/1.1/' xmlns:ns1='http://schemas.openxmlformats.org/package/2006/metadata/core-properties' " w:xpath="/ns1:coreProperties[1]/ns0:title[1]" w:storeItemID="{6C3C8BC8-F283-45AE-878A-BAB7291924A1}"/>
+            <w:text/>
+          </w:sdtPr>
+          <w:sdtEndPr>
+            <w:rPr>
+              <w:sz w:val="80"/>
+              <w:szCs w:val="80"/>
+            </w:rPr>
+          </w:sdtEndPr>
+          <w:sdtContent>
+            <w:p>
+              <w:pPr>
+                <w:pStyle w:val="NoSpacing"/>
+                <w:pBdr>
+                  <w:top w:val="single" w:sz="6" w:space="6" w:color="4472C4" w:themeColor="accent1"/>
+                  <w:bottom w:val="single" w:sz="6" w:space="6" w:color="4472C4" w:themeColor="accent1"/>
+                </w:pBdr>
+                <w:spacing w:after="240"/>
+                <w:jc w:val="center"/>
+                <w:rPr>
+                  <w:rFonts w:asciiTheme="majorHAnsi" w:eastAsiaTheme="majorEastAsia" w:hAnsiTheme="majorHAnsi" w:cstheme="majorBidi"/>
+                  <w:caps/>
+                  <w:color w:val="4472C4" w:themeColor="accent1"/>
+                  <w:sz w:val="80"/>
+                  <w:szCs w:val="80"/>
+                </w:rPr>
+              </w:pPr>
+              <w:r>
+                <w:rPr>
+                  <w:rFonts w:asciiTheme="majorHAnsi" w:eastAsiaTheme="majorEastAsia" w:hAnsiTheme="majorHAnsi" w:cstheme="majorBidi"/>
+                  <w:caps/>
+                  <w:color w:val="4472C4" w:themeColor="accent1"/>
+                  <w:sz w:val="72"/>
+                  <w:szCs w:val="72"/>
+                </w:rPr>
+                <w:t>FSWD Lab 2</w:t>
+              </w:r>
+            </w:p>
+          </w:sdtContent>
+        </w:sdt>
+        <w:sdt>
+          <w:sdtPr>
+            <w:rPr>
+              <w:color w:val="4472C4" w:themeColor="accent1"/>
+              <w:sz w:val="28"/>
+              <w:szCs w:val="28"/>
+            </w:rPr>
+            <w:alias w:val="Subtitle"/>
+            <w:tag w:val=""/>
+            <w:id w:val="328029620"/>
+            <w:placeholder>
+              <w:docPart w:val="B19AD2CAABA043BFBE5996EA118F6218"/>
+            </w:placeholder>
+            <w:dataBinding w:prefixMappings="xmlns:ns0='http://purl.org/dc/elements/1.1/' xmlns:ns1='http://schemas.openxmlformats.org/package/2006/metadata/core-properties' " w:xpath="/ns1:coreProperties[1]/ns0:subject[1]" w:storeItemID="{6C3C8BC8-F283-45AE-878A-BAB7291924A1}"/>
+            <w:text/>
+          </w:sdtPr>
+          <w:sdtContent>
+            <w:p>
+              <w:pPr>
+                <w:pStyle w:val="NoSpacing"/>
+                <w:jc w:val="center"/>
+                <w:rPr>
+                  <w:color w:val="4472C4" w:themeColor="accent1"/>
+                  <w:sz w:val="28"/>
+                  <w:szCs w:val="28"/>
+                </w:rPr>
+              </w:pPr>
+              <w:r>
+                <w:rPr>
+                  <w:color w:val="4472C4" w:themeColor="accent1"/>
+                  <w:sz w:val="28"/>
+                  <w:szCs w:val="28"/>
+                </w:rPr>
+                <w:t>Maryam Jahangir 241949</w:t>
+              </w:r>
+            </w:p>
+          </w:sdtContent>
+        </w:sdt>
+        <w:p>
+          <w:pPr>
+            <w:pStyle w:val="NoSpacing"/>
+            <w:spacing w:before="480"/>
+            <w:jc w:val="center"/>
+            <w:rPr>
+              <w:color w:val="4472C4" w:themeColor="accent1"/>
+            </w:rPr>
+          </w:pPr>
+          <w:r>
+            <w:rPr>
+              <w:noProof/>
+              <w:color w:val="4472C4" w:themeColor="accent1"/>
+            </w:rPr>
+            <w:drawing>
+              <wp:inline distT="0" distB="0" distL="0" distR="0" wp14:anchorId="4B37AF43" wp14:editId="36136B8B">
+                <wp:extent cx="758952" cy="478932"/>
+                <wp:effectExtent l="0" t="0" r="3175" b="0"/>
+                <wp:docPr id="144" name="Picture 147"/>
+                <wp:cNvGraphicFramePr>
+                  <a:graphicFrameLocks xmlns:a="http://schemas.openxmlformats.org/drawingml/2006/main" noChangeAspect="1"/>
+                </wp:cNvGraphicFramePr>
+                <a:graphic xmlns:a="http://schemas.openxmlformats.org/drawingml/2006/main">
+                  <a:graphicData uri="http://schemas.openxmlformats.org/drawingml/2006/picture">
+                    <pic:pic xmlns:pic="http://schemas.openxmlformats.org/drawingml/2006/picture">
+                      <pic:nvPicPr>
+                        <pic:cNvPr id="9" name="roco bottom.png"/>
+                        <pic:cNvPicPr/>
+                      </pic:nvPicPr>
+                      <pic:blipFill>
+                        <a:blip r:embed="rId6" cstate="print">
+                          <a:duotone>
+                            <a:schemeClr val="accent1">
+                              <a:shade val="45000"/>
+                              <a:satMod val="135000"/>
+                            </a:schemeClr>
+                            <a:prstClr val="white"/>
+                          </a:duotone>
+                          <a:extLst>
+                            <a:ext uri="{28A0092B-C50C-407E-A947-70E740481C1C}">
+                              <a14:useLocalDpi xmlns:a14="http://schemas.microsoft.com/office/drawing/2010/main" val="0"/>
+                            </a:ext>
+                          </a:extLst>
+                        </a:blip>
+                        <a:stretch>
+                          <a:fillRect/>
+                        </a:stretch>
+                      </pic:blipFill>
+                      <pic:spPr>
+                        <a:xfrm>
+                          <a:off x="0" y="0"/>
+                          <a:ext cx="758952" cy="478932"/>
+                        </a:xfrm>
+                        <a:prstGeom prst="rect">
+                          <a:avLst/>
+                        </a:prstGeom>
+                      </pic:spPr>
+                    </pic:pic>
+                  </a:graphicData>
+                </a:graphic>
+              </wp:inline>
+            </w:drawing>
+          </w:r>
+        </w:p>
+        <w:p>
+          <w:r>
+            <w:br w:type="page"/>
+          </w:r>
+        </w:p>
+      </w:sdtContent>
+    </w:sdt>
+    <w:p>
+      <w:pPr>
+        <w:rPr>
+          <w:noProof/>
+        </w:rPr>
+      </w:pPr>
+    </w:p>
+    <w:p>
+      <w:pPr>
+        <w:rPr>
+          <w:rFonts w:ascii="Times New Roman" w:hAnsi="Times New Roman" w:cs="Times New Roman"/>
+          <w:b/>
+          <w:bCs/>
+          <w:noProof/>
+          <w:sz w:val="44"/>
+          <w:szCs w:val="44"/>
+        </w:rPr>
+      </w:pPr>
+      <w:r>
+        <w:rPr>
+          <w:rFonts w:ascii="Times New Roman" w:hAnsi="Times New Roman" w:cs="Times New Roman"/>
+          <w:b/>
+          <w:bCs/>
+          <w:noProof/>
+          <w:sz w:val="44"/>
+          <w:szCs w:val="44"/>
+        </w:rPr>
+        <w:t>Registration form</w:t>
+      </w:r>
+    </w:p>
+    <w:p>
+      <w:pPr>
+        <w:rPr>
+          <w:rFonts w:ascii="Times New Roman" w:hAnsi="Times New Roman" w:cs="Times New Roman"/>
+          <w:noProof/>
+          <w:sz w:val="28"/>
+          <w:szCs w:val="28"/>
+        </w:rPr>
+      </w:pPr>
+      <w:r>
+        <w:rPr>
+          <w:rFonts w:ascii="Times New Roman" w:hAnsi="Times New Roman" w:cs="Times New Roman"/>
+          <w:noProof/>
+          <w:sz w:val="28"/>
+          <w:szCs w:val="28"/>
+        </w:rPr>
+        <w:t>Registration</w:t>
+      </w:r>
+      <w:r>
+        <w:rPr>
+          <w:rFonts w:ascii="Times New Roman" w:hAnsi="Times New Roman" w:cs="Times New Roman"/>
+          <w:noProof/>
+          <w:sz w:val="28"/>
+          <w:szCs w:val="28"/>
+        </w:rPr>
+        <w:t xml:space="preserve"> form in the middle of a green page. It has two columns of fields, gender radio buttons and a Register button.</w:t>
+      </w:r>
+    </w:p>
+    <w:p>
+      <w:pPr>
+        <w:rPr>
+          <w:rFonts w:ascii="Times New Roman" w:hAnsi="Times New Roman" w:cs="Times New Roman"/>
+          <w:noProof/>
+          <w:sz w:val="44"/>
+          <w:szCs w:val="44"/>
+        </w:rPr>
+      </w:pPr>
+      <w:r>
+        <w:rPr>
+          <w:noProof/>
+        </w:rPr>
         <w:drawing>
           <wp:inline distT="0" distB="0" distL="0" distR="0" wp14:anchorId="5EE76DAA" wp14:editId="162C4493">
             <wp:extent cx="5731510" cy="3220720"/>
@@ -20,7 +341,7 @@
                     <pic:cNvPicPr/>
                   </pic:nvPicPr>
                   <pic:blipFill>
-                    <a:blip r:embed="rId4"/>
+                    <a:blip r:embed="rId7"/>
                     <a:stretch>
                       <a:fillRect/>
                     </a:stretch>
@@ -41,14 +362,1127 @@
         </w:drawing>
       </w:r>
     </w:p>
+    <w:p>
+      <w:pPr>
+        <w:numPr>
+          <w:ilvl w:val="0"/>
+          <w:numId w:val="1"/>
+        </w:numPr>
+        <w:rPr>
+          <w:rFonts w:ascii="Times New Roman" w:hAnsi="Times New Roman" w:cs="Times New Roman"/>
+          <w:noProof/>
+          <w:sz w:val="28"/>
+          <w:szCs w:val="28"/>
+        </w:rPr>
+      </w:pPr>
+      <w:r>
+        <w:rPr>
+          <w:rFonts w:ascii="Times New Roman" w:hAnsi="Times New Roman" w:cs="Times New Roman"/>
+          <w:noProof/>
+          <w:sz w:val="28"/>
+          <w:szCs w:val="28"/>
+        </w:rPr>
+        <w:t>Made the HTML page and linked Bootstrap 5.</w:t>
+      </w:r>
+    </w:p>
+    <w:p>
+      <w:pPr>
+        <w:numPr>
+          <w:ilvl w:val="0"/>
+          <w:numId w:val="1"/>
+        </w:numPr>
+        <w:rPr>
+          <w:rFonts w:ascii="Times New Roman" w:hAnsi="Times New Roman" w:cs="Times New Roman"/>
+          <w:noProof/>
+          <w:sz w:val="28"/>
+          <w:szCs w:val="28"/>
+        </w:rPr>
+      </w:pPr>
+      <w:r>
+        <w:rPr>
+          <w:rFonts w:ascii="Times New Roman" w:hAnsi="Times New Roman" w:cs="Times New Roman"/>
+          <w:noProof/>
+          <w:sz w:val="28"/>
+          <w:szCs w:val="28"/>
+        </w:rPr>
+        <w:t>Used Flexbox to keep the white form card in the centre of the page.</w:t>
+      </w:r>
+    </w:p>
+    <w:p>
+      <w:pPr>
+        <w:ind w:left="540"/>
+        <w:rPr>
+          <w:rFonts w:ascii="Times New Roman" w:hAnsi="Times New Roman" w:cs="Times New Roman"/>
+          <w:noProof/>
+          <w:sz w:val="28"/>
+          <w:szCs w:val="28"/>
+        </w:rPr>
+      </w:pPr>
+      <w:r>
+        <w:rPr>
+          <w:rFonts w:ascii="Times New Roman" w:hAnsi="Times New Roman" w:cs="Times New Roman"/>
+          <w:noProof/>
+          <w:sz w:val="28"/>
+          <w:szCs w:val="28"/>
+        </w:rPr>
+        <w:t xml:space="preserve">By justify content center </w:t>
+      </w:r>
+    </w:p>
+    <w:p>
+      <w:pPr>
+        <w:numPr>
+          <w:ilvl w:val="0"/>
+          <w:numId w:val="1"/>
+        </w:numPr>
+        <w:rPr>
+          <w:rFonts w:ascii="Times New Roman" w:hAnsi="Times New Roman" w:cs="Times New Roman"/>
+          <w:noProof/>
+          <w:sz w:val="28"/>
+          <w:szCs w:val="28"/>
+        </w:rPr>
+      </w:pPr>
+      <w:r>
+        <w:rPr>
+          <w:rFonts w:ascii="Times New Roman" w:hAnsi="Times New Roman" w:cs="Times New Roman"/>
+          <w:noProof/>
+          <w:sz w:val="28"/>
+          <w:szCs w:val="28"/>
+        </w:rPr>
+        <w:t>Bootstrap grid (row and columns) to put two fields side by side.</w:t>
+      </w:r>
+    </w:p>
+    <w:p>
+      <w:pPr>
+        <w:numPr>
+          <w:ilvl w:val="0"/>
+          <w:numId w:val="1"/>
+        </w:numPr>
+        <w:rPr>
+          <w:rFonts w:ascii="Times New Roman" w:hAnsi="Times New Roman" w:cs="Times New Roman"/>
+          <w:noProof/>
+          <w:sz w:val="28"/>
+          <w:szCs w:val="28"/>
+        </w:rPr>
+      </w:pPr>
+      <w:r>
+        <w:rPr>
+          <w:rFonts w:ascii="Times New Roman" w:hAnsi="Times New Roman" w:cs="Times New Roman"/>
+          <w:noProof/>
+          <w:sz w:val="28"/>
+          <w:szCs w:val="28"/>
+        </w:rPr>
+        <w:t>Bootstrap classes form-label and form-control for the labels and input boxes.</w:t>
+      </w:r>
+    </w:p>
+    <w:p>
+      <w:pPr>
+        <w:numPr>
+          <w:ilvl w:val="0"/>
+          <w:numId w:val="1"/>
+        </w:numPr>
+        <w:rPr>
+          <w:rFonts w:ascii="Times New Roman" w:hAnsi="Times New Roman" w:cs="Times New Roman"/>
+          <w:noProof/>
+          <w:sz w:val="28"/>
+          <w:szCs w:val="28"/>
+        </w:rPr>
+      </w:pPr>
+      <w:r>
+        <w:rPr>
+          <w:rFonts w:ascii="Times New Roman" w:hAnsi="Times New Roman" w:cs="Times New Roman"/>
+          <w:noProof/>
+          <w:sz w:val="28"/>
+          <w:szCs w:val="28"/>
+        </w:rPr>
+        <w:t>Added three radio buttons with the same name, so only one can be selected.</w:t>
+      </w:r>
+    </w:p>
+    <w:p>
+      <w:pPr>
+        <w:numPr>
+          <w:ilvl w:val="0"/>
+          <w:numId w:val="1"/>
+        </w:numPr>
+        <w:rPr>
+          <w:rFonts w:ascii="Times New Roman" w:hAnsi="Times New Roman" w:cs="Times New Roman"/>
+          <w:noProof/>
+          <w:sz w:val="28"/>
+          <w:szCs w:val="28"/>
+        </w:rPr>
+      </w:pPr>
+      <w:r>
+        <w:rPr>
+          <w:rFonts w:ascii="Times New Roman" w:hAnsi="Times New Roman" w:cs="Times New Roman"/>
+          <w:noProof/>
+          <w:sz w:val="28"/>
+          <w:szCs w:val="28"/>
+        </w:rPr>
+        <w:t>Styled the Register button with full width, a round border-radius and my own colour.</w:t>
+      </w:r>
+    </w:p>
+    <w:p>
+      <w:pPr>
+        <w:rPr>
+          <w:rFonts w:ascii="Times New Roman" w:hAnsi="Times New Roman" w:cs="Times New Roman"/>
+          <w:noProof/>
+          <w:sz w:val="44"/>
+          <w:szCs w:val="44"/>
+        </w:rPr>
+      </w:pPr>
+    </w:p>
+    <w:p>
+      <w:pPr>
+        <w:rPr>
+          <w:rFonts w:ascii="Times New Roman" w:hAnsi="Times New Roman" w:cs="Times New Roman"/>
+          <w:b/>
+          <w:bCs/>
+          <w:noProof/>
+          <w:sz w:val="44"/>
+          <w:szCs w:val="44"/>
+        </w:rPr>
+      </w:pPr>
+      <w:r>
+        <w:rPr>
+          <w:rFonts w:ascii="Times New Roman" w:hAnsi="Times New Roman" w:cs="Times New Roman"/>
+          <w:b/>
+          <w:bCs/>
+          <w:noProof/>
+          <w:sz w:val="44"/>
+          <w:szCs w:val="44"/>
+        </w:rPr>
+        <w:t xml:space="preserve">Task 1 with </w:t>
+      </w:r>
+      <w:r>
+        <w:rPr>
+          <w:rFonts w:ascii="Times New Roman" w:hAnsi="Times New Roman" w:cs="Times New Roman"/>
+          <w:b/>
+          <w:bCs/>
+          <w:noProof/>
+          <w:sz w:val="44"/>
+          <w:szCs w:val="44"/>
+        </w:rPr>
+        <w:t>T</w:t>
+      </w:r>
+      <w:r>
+        <w:rPr>
+          <w:rFonts w:ascii="Times New Roman" w:hAnsi="Times New Roman" w:cs="Times New Roman"/>
+          <w:b/>
+          <w:bCs/>
+          <w:noProof/>
+          <w:sz w:val="44"/>
+          <w:szCs w:val="44"/>
+        </w:rPr>
+        <w:t>eacher</w:t>
+      </w:r>
+    </w:p>
+    <w:p>
+      <w:pPr>
+        <w:rPr>
+          <w:rFonts w:ascii="Times New Roman" w:hAnsi="Times New Roman" w:cs="Times New Roman"/>
+          <w:sz w:val="28"/>
+          <w:szCs w:val="28"/>
+        </w:rPr>
+      </w:pPr>
+      <w:r>
+        <w:rPr>
+          <w:rFonts w:ascii="Times New Roman" w:hAnsi="Times New Roman" w:cs="Times New Roman"/>
+          <w:sz w:val="28"/>
+          <w:szCs w:val="28"/>
+        </w:rPr>
+        <w:t xml:space="preserve">Team Page has </w:t>
+      </w:r>
+      <w:r>
+        <w:rPr>
+          <w:rFonts w:ascii="Times New Roman" w:hAnsi="Times New Roman" w:cs="Times New Roman"/>
+          <w:sz w:val="28"/>
+          <w:szCs w:val="28"/>
+        </w:rPr>
+        <w:t>three cards in a row, a Featured badge on the first card and three buttons below.</w:t>
+      </w:r>
+    </w:p>
+    <w:p/>
+    <w:p>
+      <w:r>
+        <w:rPr>
+          <w:noProof/>
+        </w:rPr>
+        <w:drawing>
+          <wp:inline distT="0" distB="0" distL="0" distR="0" wp14:anchorId="494BF7AA" wp14:editId="62CC2040">
+            <wp:extent cx="5731510" cy="3090545"/>
+            <wp:effectExtent l="0" t="0" r="2540" b="0"/>
+            <wp:docPr id="1841384561" name="Picture 1"/>
+            <wp:cNvGraphicFramePr>
+              <a:graphicFrameLocks xmlns:a="http://schemas.openxmlformats.org/drawingml/2006/main" noChangeAspect="1"/>
+            </wp:cNvGraphicFramePr>
+            <a:graphic xmlns:a="http://schemas.openxmlformats.org/drawingml/2006/main">
+              <a:graphicData uri="http://schemas.openxmlformats.org/drawingml/2006/picture">
+                <pic:pic xmlns:pic="http://schemas.openxmlformats.org/drawingml/2006/picture">
+                  <pic:nvPicPr>
+                    <pic:cNvPr id="1841384561" name=""/>
+                    <pic:cNvPicPr/>
+                  </pic:nvPicPr>
+                  <pic:blipFill>
+                    <a:blip r:embed="rId8"/>
+                    <a:stretch>
+                      <a:fillRect/>
+                    </a:stretch>
+                  </pic:blipFill>
+                  <pic:spPr>
+                    <a:xfrm>
+                      <a:off x="0" y="0"/>
+                      <a:ext cx="5731510" cy="3090545"/>
+                    </a:xfrm>
+                    <a:prstGeom prst="rect">
+                      <a:avLst/>
+                    </a:prstGeom>
+                  </pic:spPr>
+                </pic:pic>
+              </a:graphicData>
+            </a:graphic>
+          </wp:inline>
+        </w:drawing>
+      </w:r>
+    </w:p>
+    <w:p>
+      <w:pPr>
+        <w:numPr>
+          <w:ilvl w:val="0"/>
+          <w:numId w:val="1"/>
+        </w:numPr>
+        <w:rPr>
+          <w:rFonts w:ascii="Times New Roman" w:hAnsi="Times New Roman" w:cs="Times New Roman"/>
+          <w:sz w:val="28"/>
+          <w:szCs w:val="28"/>
+        </w:rPr>
+      </w:pPr>
+      <w:r>
+        <w:rPr>
+          <w:rFonts w:ascii="Times New Roman" w:hAnsi="Times New Roman" w:cs="Times New Roman"/>
+          <w:sz w:val="28"/>
+          <w:szCs w:val="28"/>
+        </w:rPr>
+        <w:t>Put the three cards in one div and made it a flex row with display: flex and gap.</w:t>
+      </w:r>
+    </w:p>
+    <w:p>
+      <w:pPr>
+        <w:numPr>
+          <w:ilvl w:val="0"/>
+          <w:numId w:val="1"/>
+        </w:numPr>
+        <w:rPr>
+          <w:rFonts w:ascii="Times New Roman" w:hAnsi="Times New Roman" w:cs="Times New Roman"/>
+          <w:sz w:val="28"/>
+          <w:szCs w:val="28"/>
+        </w:rPr>
+      </w:pPr>
+      <w:r>
+        <w:rPr>
+          <w:rFonts w:ascii="Times New Roman" w:hAnsi="Times New Roman" w:cs="Times New Roman"/>
+          <w:sz w:val="28"/>
+          <w:szCs w:val="28"/>
+        </w:rPr>
+        <w:t>Gave the cards border-radius, box-shadow and padding.</w:t>
+      </w:r>
+    </w:p>
+    <w:p>
+      <w:pPr>
+        <w:numPr>
+          <w:ilvl w:val="0"/>
+          <w:numId w:val="1"/>
+        </w:numPr>
+        <w:rPr>
+          <w:rFonts w:ascii="Times New Roman" w:hAnsi="Times New Roman" w:cs="Times New Roman"/>
+          <w:sz w:val="28"/>
+          <w:szCs w:val="28"/>
+        </w:rPr>
+      </w:pPr>
+      <w:r>
+        <w:rPr>
+          <w:rFonts w:ascii="Times New Roman" w:hAnsi="Times New Roman" w:cs="Times New Roman"/>
+          <w:sz w:val="28"/>
+          <w:szCs w:val="28"/>
+        </w:rPr>
+        <w:t>Made the card position: relative and the Featured badge position: absolute, so the badge stays in the corner.</w:t>
+      </w:r>
+    </w:p>
+    <w:p>
+      <w:pPr>
+        <w:numPr>
+          <w:ilvl w:val="0"/>
+          <w:numId w:val="1"/>
+        </w:numPr>
+        <w:rPr>
+          <w:rFonts w:ascii="Times New Roman" w:hAnsi="Times New Roman" w:cs="Times New Roman"/>
+          <w:sz w:val="28"/>
+          <w:szCs w:val="28"/>
+        </w:rPr>
+      </w:pPr>
+      <w:r>
+        <w:rPr>
+          <w:rFonts w:ascii="Times New Roman" w:hAnsi="Times New Roman" w:cs="Times New Roman"/>
+          <w:sz w:val="28"/>
+          <w:szCs w:val="28"/>
+        </w:rPr>
+        <w:t>Put the buttons in another flex row. They still have the default browser style here.</w:t>
+      </w:r>
+    </w:p>
+    <w:p>
+      <w:pPr>
+        <w:ind w:left="540"/>
+        <w:rPr>
+          <w:rFonts w:ascii="Times New Roman" w:hAnsi="Times New Roman" w:cs="Times New Roman"/>
+          <w:sz w:val="28"/>
+          <w:szCs w:val="28"/>
+        </w:rPr>
+      </w:pPr>
+    </w:p>
+    <w:p>
+      <w:pPr>
+        <w:rPr>
+          <w:b/>
+          <w:bCs/>
+        </w:rPr>
+      </w:pPr>
+      <w:r>
+        <w:rPr>
+          <w:rFonts w:ascii="Times New Roman" w:hAnsi="Times New Roman" w:cs="Times New Roman"/>
+          <w:b/>
+          <w:bCs/>
+          <w:noProof/>
+          <w:sz w:val="44"/>
+          <w:szCs w:val="44"/>
+        </w:rPr>
+        <w:t>Home Task</w:t>
+      </w:r>
+      <w:r>
+        <w:rPr>
+          <w:rFonts w:ascii="Times New Roman" w:hAnsi="Times New Roman" w:cs="Times New Roman"/>
+          <w:b/>
+          <w:bCs/>
+          <w:noProof/>
+          <w:sz w:val="44"/>
+          <w:szCs w:val="44"/>
+        </w:rPr>
+        <w:t xml:space="preserve"> Dashboard</w:t>
+      </w:r>
+    </w:p>
+    <w:p>
+      <w:r>
+        <w:rPr>
+          <w:rFonts w:ascii="Times New Roman" w:hAnsi="Times New Roman" w:cs="Times New Roman"/>
+          <w:sz w:val="28"/>
+          <w:szCs w:val="28"/>
+        </w:rPr>
+        <w:t>D</w:t>
+      </w:r>
+      <w:r>
+        <w:rPr>
+          <w:rFonts w:ascii="Times New Roman" w:hAnsi="Times New Roman" w:cs="Times New Roman"/>
+          <w:sz w:val="28"/>
+          <w:szCs w:val="28"/>
+        </w:rPr>
+        <w:t xml:space="preserve">ashboard with a sidebar, a top bar, summary cards, a chart and a list. </w:t>
+      </w:r>
+    </w:p>
+    <w:p>
+      <w:r>
+        <w:rPr>
+          <w:noProof/>
+        </w:rPr>
+        <w:lastRenderedPageBreak/>
+        <w:drawing>
+          <wp:inline distT="0" distB="0" distL="0" distR="0" wp14:anchorId="2FF23039" wp14:editId="79246507">
+            <wp:extent cx="5731510" cy="3039745"/>
+            <wp:effectExtent l="0" t="0" r="2540" b="8255"/>
+            <wp:docPr id="1646654235" name="Picture 1"/>
+            <wp:cNvGraphicFramePr>
+              <a:graphicFrameLocks xmlns:a="http://schemas.openxmlformats.org/drawingml/2006/main" noChangeAspect="1"/>
+            </wp:cNvGraphicFramePr>
+            <a:graphic xmlns:a="http://schemas.openxmlformats.org/drawingml/2006/main">
+              <a:graphicData uri="http://schemas.openxmlformats.org/drawingml/2006/picture">
+                <pic:pic xmlns:pic="http://schemas.openxmlformats.org/drawingml/2006/picture">
+                  <pic:nvPicPr>
+                    <pic:cNvPr id="1646654235" name=""/>
+                    <pic:cNvPicPr/>
+                  </pic:nvPicPr>
+                  <pic:blipFill>
+                    <a:blip r:embed="rId9"/>
+                    <a:stretch>
+                      <a:fillRect/>
+                    </a:stretch>
+                  </pic:blipFill>
+                  <pic:spPr>
+                    <a:xfrm>
+                      <a:off x="0" y="0"/>
+                      <a:ext cx="5731510" cy="3039745"/>
+                    </a:xfrm>
+                    <a:prstGeom prst="rect">
+                      <a:avLst/>
+                    </a:prstGeom>
+                  </pic:spPr>
+                </pic:pic>
+              </a:graphicData>
+            </a:graphic>
+          </wp:inline>
+        </w:drawing>
+      </w:r>
+      <w:r>
+        <w:rPr>
+          <w:noProof/>
+        </w:rPr>
+        <w:drawing>
+          <wp:inline distT="0" distB="0" distL="0" distR="0" wp14:anchorId="6EDF863B" wp14:editId="0CDAF6AE">
+            <wp:extent cx="5731510" cy="3056890"/>
+            <wp:effectExtent l="0" t="0" r="2540" b="0"/>
+            <wp:docPr id="1007758582" name="Picture 1"/>
+            <wp:cNvGraphicFramePr>
+              <a:graphicFrameLocks xmlns:a="http://schemas.openxmlformats.org/drawingml/2006/main" noChangeAspect="1"/>
+            </wp:cNvGraphicFramePr>
+            <a:graphic xmlns:a="http://schemas.openxmlformats.org/drawingml/2006/main">
+              <a:graphicData uri="http://schemas.openxmlformats.org/drawingml/2006/picture">
+                <pic:pic xmlns:pic="http://schemas.openxmlformats.org/drawingml/2006/picture">
+                  <pic:nvPicPr>
+                    <pic:cNvPr id="1007758582" name=""/>
+                    <pic:cNvPicPr/>
+                  </pic:nvPicPr>
+                  <pic:blipFill>
+                    <a:blip r:embed="rId10"/>
+                    <a:stretch>
+                      <a:fillRect/>
+                    </a:stretch>
+                  </pic:blipFill>
+                  <pic:spPr>
+                    <a:xfrm>
+                      <a:off x="0" y="0"/>
+                      <a:ext cx="5731510" cy="3056890"/>
+                    </a:xfrm>
+                    <a:prstGeom prst="rect">
+                      <a:avLst/>
+                    </a:prstGeom>
+                  </pic:spPr>
+                </pic:pic>
+              </a:graphicData>
+            </a:graphic>
+          </wp:inline>
+        </w:drawing>
+      </w:r>
+      <w:r>
+        <w:lastRenderedPageBreak/>
+        <w:drawing>
+          <wp:inline distT="0" distB="0" distL="0" distR="0" wp14:anchorId="483BFCE8" wp14:editId="48E95461">
+            <wp:extent cx="5731510" cy="6388100"/>
+            <wp:effectExtent l="0" t="0" r="2540" b="0"/>
+            <wp:docPr id="676799818" name="Picture 1"/>
+            <wp:cNvGraphicFramePr>
+              <a:graphicFrameLocks xmlns:a="http://schemas.openxmlformats.org/drawingml/2006/main" noChangeAspect="1"/>
+            </wp:cNvGraphicFramePr>
+            <a:graphic xmlns:a="http://schemas.openxmlformats.org/drawingml/2006/main">
+              <a:graphicData uri="http://schemas.openxmlformats.org/drawingml/2006/picture">
+                <pic:pic xmlns:pic="http://schemas.openxmlformats.org/drawingml/2006/picture">
+                  <pic:nvPicPr>
+                    <pic:cNvPr id="676799818" name=""/>
+                    <pic:cNvPicPr/>
+                  </pic:nvPicPr>
+                  <pic:blipFill>
+                    <a:blip r:embed="rId11"/>
+                    <a:stretch>
+                      <a:fillRect/>
+                    </a:stretch>
+                  </pic:blipFill>
+                  <pic:spPr>
+                    <a:xfrm>
+                      <a:off x="0" y="0"/>
+                      <a:ext cx="5731510" cy="6388100"/>
+                    </a:xfrm>
+                    <a:prstGeom prst="rect">
+                      <a:avLst/>
+                    </a:prstGeom>
+                  </pic:spPr>
+                </pic:pic>
+              </a:graphicData>
+            </a:graphic>
+          </wp:inline>
+        </w:drawing>
+      </w:r>
+      <w:r>
+        <w:lastRenderedPageBreak/>
+        <w:drawing>
+          <wp:inline distT="0" distB="0" distL="0" distR="0" wp14:anchorId="3913DB59" wp14:editId="3125C320">
+            <wp:extent cx="5731510" cy="6457950"/>
+            <wp:effectExtent l="0" t="0" r="2540" b="0"/>
+            <wp:docPr id="1067278930" name="Picture 1"/>
+            <wp:cNvGraphicFramePr>
+              <a:graphicFrameLocks xmlns:a="http://schemas.openxmlformats.org/drawingml/2006/main" noChangeAspect="1"/>
+            </wp:cNvGraphicFramePr>
+            <a:graphic xmlns:a="http://schemas.openxmlformats.org/drawingml/2006/main">
+              <a:graphicData uri="http://schemas.openxmlformats.org/drawingml/2006/picture">
+                <pic:pic xmlns:pic="http://schemas.openxmlformats.org/drawingml/2006/picture">
+                  <pic:nvPicPr>
+                    <pic:cNvPr id="1067278930" name=""/>
+                    <pic:cNvPicPr/>
+                  </pic:nvPicPr>
+                  <pic:blipFill>
+                    <a:blip r:embed="rId12"/>
+                    <a:stretch>
+                      <a:fillRect/>
+                    </a:stretch>
+                  </pic:blipFill>
+                  <pic:spPr>
+                    <a:xfrm>
+                      <a:off x="0" y="0"/>
+                      <a:ext cx="5731510" cy="6457950"/>
+                    </a:xfrm>
+                    <a:prstGeom prst="rect">
+                      <a:avLst/>
+                    </a:prstGeom>
+                  </pic:spPr>
+                </pic:pic>
+              </a:graphicData>
+            </a:graphic>
+          </wp:inline>
+        </w:drawing>
+      </w:r>
+      <w:r>
+        <w:drawing>
+          <wp:inline distT="0" distB="0" distL="0" distR="0" wp14:anchorId="09615B29" wp14:editId="75034C4B">
+            <wp:extent cx="5731510" cy="2046605"/>
+            <wp:effectExtent l="0" t="0" r="2540" b="0"/>
+            <wp:docPr id="1952563020" name="Picture 1"/>
+            <wp:cNvGraphicFramePr>
+              <a:graphicFrameLocks xmlns:a="http://schemas.openxmlformats.org/drawingml/2006/main" noChangeAspect="1"/>
+            </wp:cNvGraphicFramePr>
+            <a:graphic xmlns:a="http://schemas.openxmlformats.org/drawingml/2006/main">
+              <a:graphicData uri="http://schemas.openxmlformats.org/drawingml/2006/picture">
+                <pic:pic xmlns:pic="http://schemas.openxmlformats.org/drawingml/2006/picture">
+                  <pic:nvPicPr>
+                    <pic:cNvPr id="1952563020" name=""/>
+                    <pic:cNvPicPr/>
+                  </pic:nvPicPr>
+                  <pic:blipFill>
+                    <a:blip r:embed="rId13"/>
+                    <a:stretch>
+                      <a:fillRect/>
+                    </a:stretch>
+                  </pic:blipFill>
+                  <pic:spPr>
+                    <a:xfrm>
+                      <a:off x="0" y="0"/>
+                      <a:ext cx="5731510" cy="2046605"/>
+                    </a:xfrm>
+                    <a:prstGeom prst="rect">
+                      <a:avLst/>
+                    </a:prstGeom>
+                  </pic:spPr>
+                </pic:pic>
+              </a:graphicData>
+            </a:graphic>
+          </wp:inline>
+        </w:drawing>
+      </w:r>
+    </w:p>
+    <w:p>
+      <w:pPr>
+        <w:numPr>
+          <w:ilvl w:val="0"/>
+          <w:numId w:val="1"/>
+        </w:numPr>
+        <w:rPr>
+          <w:rFonts w:ascii="Times New Roman" w:hAnsi="Times New Roman" w:cs="Times New Roman"/>
+          <w:sz w:val="28"/>
+          <w:szCs w:val="28"/>
+        </w:rPr>
+      </w:pPr>
+      <w:r>
+        <w:rPr>
+          <w:rFonts w:ascii="Times New Roman" w:hAnsi="Times New Roman" w:cs="Times New Roman"/>
+          <w:sz w:val="28"/>
+          <w:szCs w:val="28"/>
+        </w:rPr>
+        <w:t>It’s responsive by using @media query</w:t>
+      </w:r>
+    </w:p>
+    <w:p>
+      <w:pPr>
+        <w:numPr>
+          <w:ilvl w:val="0"/>
+          <w:numId w:val="1"/>
+        </w:numPr>
+        <w:rPr>
+          <w:rFonts w:ascii="Times New Roman" w:hAnsi="Times New Roman" w:cs="Times New Roman"/>
+          <w:sz w:val="28"/>
+          <w:szCs w:val="28"/>
+        </w:rPr>
+      </w:pPr>
+      <w:r>
+        <w:rPr>
+          <w:rFonts w:ascii="Times New Roman" w:hAnsi="Times New Roman" w:cs="Times New Roman"/>
+          <w:sz w:val="28"/>
+          <w:szCs w:val="28"/>
+        </w:rPr>
+        <w:lastRenderedPageBreak/>
+        <w:t>d-flex to put the sidebar and the main content side by side. On a phone the sidebar becomes a slide-in menu (Bootstrap offcanvas).</w:t>
+      </w:r>
+    </w:p>
+    <w:p>
+      <w:pPr>
+        <w:numPr>
+          <w:ilvl w:val="0"/>
+          <w:numId w:val="1"/>
+        </w:numPr>
+        <w:rPr>
+          <w:rFonts w:ascii="Times New Roman" w:hAnsi="Times New Roman" w:cs="Times New Roman"/>
+          <w:sz w:val="28"/>
+          <w:szCs w:val="28"/>
+        </w:rPr>
+      </w:pPr>
+      <w:r>
+        <w:rPr>
+          <w:rFonts w:ascii="Times New Roman" w:hAnsi="Times New Roman" w:cs="Times New Roman"/>
+          <w:sz w:val="28"/>
+          <w:szCs w:val="28"/>
+        </w:rPr>
+        <w:t>The top bar uses d-flex, an input-group for search and a rounded-circle admin photo. The red number on the bell uses position-absolute.</w:t>
+      </w:r>
+    </w:p>
+    <w:p>
+      <w:pPr>
+        <w:numPr>
+          <w:ilvl w:val="0"/>
+          <w:numId w:val="1"/>
+        </w:numPr>
+        <w:rPr>
+          <w:rFonts w:ascii="Times New Roman" w:hAnsi="Times New Roman" w:cs="Times New Roman"/>
+          <w:sz w:val="28"/>
+          <w:szCs w:val="28"/>
+        </w:rPr>
+      </w:pPr>
+      <w:r>
+        <w:rPr>
+          <w:rFonts w:ascii="Times New Roman" w:hAnsi="Times New Roman" w:cs="Times New Roman"/>
+          <w:sz w:val="28"/>
+          <w:szCs w:val="28"/>
+        </w:rPr>
+        <w:t>The four summary cards use the Bootstrap grid (row, col) and the card class.</w:t>
+      </w:r>
+    </w:p>
+    <w:p>
+      <w:pPr>
+        <w:numPr>
+          <w:ilvl w:val="0"/>
+          <w:numId w:val="1"/>
+        </w:numPr>
+        <w:rPr>
+          <w:rFonts w:ascii="Times New Roman" w:hAnsi="Times New Roman" w:cs="Times New Roman"/>
+          <w:sz w:val="28"/>
+          <w:szCs w:val="28"/>
+        </w:rPr>
+      </w:pPr>
+      <w:r>
+        <w:rPr>
+          <w:rFonts w:ascii="Times New Roman" w:hAnsi="Times New Roman" w:cs="Times New Roman"/>
+          <w:sz w:val="28"/>
+          <w:szCs w:val="28"/>
+        </w:rPr>
+        <w:t>The donut chart is made with only CSS, using conic-gradient.</w:t>
+      </w:r>
+    </w:p>
+    <w:p>
+      <w:pPr>
+        <w:numPr>
+          <w:ilvl w:val="0"/>
+          <w:numId w:val="1"/>
+        </w:numPr>
+        <w:rPr>
+          <w:rFonts w:ascii="Times New Roman" w:hAnsi="Times New Roman" w:cs="Times New Roman"/>
+          <w:sz w:val="28"/>
+          <w:szCs w:val="28"/>
+        </w:rPr>
+      </w:pPr>
+      <w:r>
+        <w:rPr>
+          <w:rFonts w:ascii="Times New Roman" w:hAnsi="Times New Roman" w:cs="Times New Roman"/>
+          <w:sz w:val="28"/>
+          <w:szCs w:val="28"/>
+        </w:rPr>
+        <w:t>The Tickets sold today card has a dashed line with two small circles made with ::before and ::after.</w:t>
+      </w:r>
+    </w:p>
+    <w:p>
+      <w:pPr>
+        <w:numPr>
+          <w:ilvl w:val="0"/>
+          <w:numId w:val="1"/>
+        </w:numPr>
+        <w:rPr>
+          <w:rFonts w:ascii="Times New Roman" w:hAnsi="Times New Roman" w:cs="Times New Roman"/>
+          <w:sz w:val="28"/>
+          <w:szCs w:val="28"/>
+        </w:rPr>
+      </w:pPr>
+      <w:r>
+        <w:rPr>
+          <w:rFonts w:ascii="Times New Roman" w:hAnsi="Times New Roman" w:cs="Times New Roman"/>
+          <w:sz w:val="28"/>
+          <w:szCs w:val="28"/>
+        </w:rPr>
+        <w:t>Recent activity uses list-group, and the bars use Bootstrap progress.</w:t>
+      </w:r>
+    </w:p>
+    <w:p>
+      <w:pPr>
+        <w:rPr>
+          <w:b/>
+          <w:bCs/>
+        </w:rPr>
+      </w:pPr>
+      <w:r>
+        <w:rPr>
+          <w:rFonts w:ascii="Times New Roman" w:hAnsi="Times New Roman" w:cs="Times New Roman"/>
+          <w:b/>
+          <w:bCs/>
+          <w:noProof/>
+          <w:sz w:val="44"/>
+          <w:szCs w:val="44"/>
+        </w:rPr>
+        <w:t>Task 2 for home</w:t>
+      </w:r>
+    </w:p>
+    <w:p>
+      <w:r>
+        <w:rPr>
+          <w:noProof/>
+        </w:rPr>
+        <w:drawing>
+          <wp:inline distT="0" distB="0" distL="0" distR="0" wp14:anchorId="29E6EB07" wp14:editId="6F45597A">
+            <wp:extent cx="5731510" cy="3073400"/>
+            <wp:effectExtent l="0" t="0" r="2540" b="0"/>
+            <wp:docPr id="1106758094" name="Picture 1"/>
+            <wp:cNvGraphicFramePr>
+              <a:graphicFrameLocks xmlns:a="http://schemas.openxmlformats.org/drawingml/2006/main" noChangeAspect="1"/>
+            </wp:cNvGraphicFramePr>
+            <a:graphic xmlns:a="http://schemas.openxmlformats.org/drawingml/2006/main">
+              <a:graphicData uri="http://schemas.openxmlformats.org/drawingml/2006/picture">
+                <pic:pic xmlns:pic="http://schemas.openxmlformats.org/drawingml/2006/picture">
+                  <pic:nvPicPr>
+                    <pic:cNvPr id="1106758094" name=""/>
+                    <pic:cNvPicPr/>
+                  </pic:nvPicPr>
+                  <pic:blipFill>
+                    <a:blip r:embed="rId14"/>
+                    <a:stretch>
+                      <a:fillRect/>
+                    </a:stretch>
+                  </pic:blipFill>
+                  <pic:spPr>
+                    <a:xfrm>
+                      <a:off x="0" y="0"/>
+                      <a:ext cx="5731510" cy="3073400"/>
+                    </a:xfrm>
+                    <a:prstGeom prst="rect">
+                      <a:avLst/>
+                    </a:prstGeom>
+                  </pic:spPr>
+                </pic:pic>
+              </a:graphicData>
+            </a:graphic>
+          </wp:inline>
+        </w:drawing>
+      </w:r>
+    </w:p>
+    <w:p>
+      <w:pPr>
+        <w:numPr>
+          <w:ilvl w:val="0"/>
+          <w:numId w:val="1"/>
+        </w:numPr>
+        <w:rPr>
+          <w:rFonts w:ascii="Times New Roman" w:hAnsi="Times New Roman" w:cs="Times New Roman"/>
+          <w:sz w:val="28"/>
+          <w:szCs w:val="28"/>
+        </w:rPr>
+      </w:pPr>
+      <w:r>
+        <w:rPr>
+          <w:rFonts w:ascii="Times New Roman" w:hAnsi="Times New Roman" w:cs="Times New Roman"/>
+          <w:b/>
+          <w:bCs/>
+          <w:sz w:val="28"/>
+          <w:szCs w:val="28"/>
+        </w:rPr>
+        <w:t>Task 1:</w:t>
+      </w:r>
+      <w:r>
+        <w:rPr>
+          <w:rFonts w:ascii="Times New Roman" w:hAnsi="Times New Roman" w:cs="Times New Roman"/>
+          <w:sz w:val="28"/>
+          <w:szCs w:val="28"/>
+        </w:rPr>
+        <w:t xml:space="preserve"> The three cards are inside a container with display: flex, flex-wrap: wrap and gap, so they wrap on small screens.</w:t>
+      </w:r>
+    </w:p>
+    <w:p>
+      <w:pPr>
+        <w:numPr>
+          <w:ilvl w:val="0"/>
+          <w:numId w:val="1"/>
+        </w:numPr>
+        <w:rPr>
+          <w:rFonts w:ascii="Times New Roman" w:hAnsi="Times New Roman" w:cs="Times New Roman"/>
+          <w:sz w:val="28"/>
+          <w:szCs w:val="28"/>
+        </w:rPr>
+      </w:pPr>
+      <w:r>
+        <w:rPr>
+          <w:rFonts w:ascii="Times New Roman" w:hAnsi="Times New Roman" w:cs="Times New Roman"/>
+          <w:b/>
+          <w:bCs/>
+          <w:sz w:val="28"/>
+          <w:szCs w:val="28"/>
+        </w:rPr>
+        <w:t>Task 2:</w:t>
+      </w:r>
+      <w:r>
+        <w:rPr>
+          <w:rFonts w:ascii="Times New Roman" w:hAnsi="Times New Roman" w:cs="Times New Roman"/>
+          <w:sz w:val="28"/>
+          <w:szCs w:val="28"/>
+        </w:rPr>
+        <w:t xml:space="preserve"> The Featured badge is position: absolute inside the card, which is position: relative.</w:t>
+      </w:r>
+    </w:p>
+    <w:p>
+      <w:pPr>
+        <w:numPr>
+          <w:ilvl w:val="0"/>
+          <w:numId w:val="1"/>
+        </w:numPr>
+        <w:rPr>
+          <w:rFonts w:ascii="Times New Roman" w:hAnsi="Times New Roman" w:cs="Times New Roman"/>
+          <w:sz w:val="28"/>
+          <w:szCs w:val="28"/>
+        </w:rPr>
+      </w:pPr>
+      <w:r>
+        <w:rPr>
+          <w:rFonts w:ascii="Times New Roman" w:hAnsi="Times New Roman" w:cs="Times New Roman"/>
+          <w:b/>
+          <w:bCs/>
+          <w:sz w:val="28"/>
+          <w:szCs w:val="28"/>
+        </w:rPr>
+        <w:t>Task 3:</w:t>
+      </w:r>
+      <w:r>
+        <w:rPr>
+          <w:rFonts w:ascii="Times New Roman" w:hAnsi="Times New Roman" w:cs="Times New Roman"/>
+          <w:sz w:val="28"/>
+          <w:szCs w:val="28"/>
+        </w:rPr>
+        <w:t xml:space="preserve"> The heading has an ::after purple underline, and the role text has a ::before star.</w:t>
+      </w:r>
+    </w:p>
+    <w:p>
+      <w:pPr>
+        <w:numPr>
+          <w:ilvl w:val="0"/>
+          <w:numId w:val="1"/>
+        </w:numPr>
+        <w:rPr>
+          <w:rFonts w:ascii="Times New Roman" w:hAnsi="Times New Roman" w:cs="Times New Roman"/>
+          <w:sz w:val="28"/>
+          <w:szCs w:val="28"/>
+        </w:rPr>
+      </w:pPr>
+      <w:r>
+        <w:rPr>
+          <w:rFonts w:ascii="Times New Roman" w:hAnsi="Times New Roman" w:cs="Times New Roman"/>
+          <w:b/>
+          <w:bCs/>
+          <w:sz w:val="28"/>
+          <w:szCs w:val="28"/>
+        </w:rPr>
+        <w:t>Task 4:</w:t>
+      </w:r>
+      <w:r>
+        <w:rPr>
+          <w:rFonts w:ascii="Times New Roman" w:hAnsi="Times New Roman" w:cs="Times New Roman"/>
+          <w:sz w:val="28"/>
+          <w:szCs w:val="28"/>
+        </w:rPr>
+        <w:t xml:space="preserve"> The cards have a drop-shadow filter. The avatars are grayscale and change to colour on hover with a transition.</w:t>
+      </w:r>
+    </w:p>
+    <w:p>
+      <w:pPr>
+        <w:numPr>
+          <w:ilvl w:val="0"/>
+          <w:numId w:val="1"/>
+        </w:numPr>
+        <w:rPr>
+          <w:rFonts w:ascii="Times New Roman" w:hAnsi="Times New Roman" w:cs="Times New Roman"/>
+          <w:sz w:val="28"/>
+          <w:szCs w:val="28"/>
+        </w:rPr>
+      </w:pPr>
+      <w:r>
+        <w:rPr>
+          <w:rFonts w:ascii="Times New Roman" w:hAnsi="Times New Roman" w:cs="Times New Roman"/>
+          <w:b/>
+          <w:bCs/>
+          <w:sz w:val="28"/>
+          <w:szCs w:val="28"/>
+        </w:rPr>
+        <w:lastRenderedPageBreak/>
+        <w:t>Task 5:</w:t>
+      </w:r>
+      <w:r>
+        <w:rPr>
+          <w:rFonts w:ascii="Times New Roman" w:hAnsi="Times New Roman" w:cs="Times New Roman"/>
+          <w:sz w:val="28"/>
+          <w:szCs w:val="28"/>
+        </w:rPr>
+        <w:t xml:space="preserve"> The button row uses Bootstrap: d-flex justify-content-center gap-3, and each button is btn btn-outline-primary.</w:t>
+      </w:r>
+    </w:p>
+    <w:p>
+      <w:pPr>
+        <w:numPr>
+          <w:ilvl w:val="0"/>
+          <w:numId w:val="1"/>
+        </w:numPr>
+        <w:rPr>
+          <w:rFonts w:ascii="Times New Roman" w:hAnsi="Times New Roman" w:cs="Times New Roman"/>
+          <w:sz w:val="28"/>
+          <w:szCs w:val="28"/>
+        </w:rPr>
+      </w:pPr>
+      <w:r>
+        <w:rPr>
+          <w:rFonts w:ascii="Times New Roman" w:hAnsi="Times New Roman" w:cs="Times New Roman"/>
+          <w:b/>
+          <w:bCs/>
+          <w:sz w:val="28"/>
+          <w:szCs w:val="28"/>
+        </w:rPr>
+        <w:t>Task 6:</w:t>
+      </w:r>
+      <w:r>
+        <w:rPr>
+          <w:rFonts w:ascii="Times New Roman" w:hAnsi="Times New Roman" w:cs="Times New Roman"/>
+          <w:sz w:val="28"/>
+          <w:szCs w:val="28"/>
+        </w:rPr>
+        <w:t xml:space="preserve"> :nth-child(even) gives the middle card a light blue background.</w:t>
+      </w:r>
+    </w:p>
+    <w:p/>
     <w:sectPr>
       <w:pgSz w:w="11906" w:h="16838"/>
       <w:pgMar w:top="1440" w:right="1440" w:bottom="1440" w:left="1440" w:header="708" w:footer="708" w:gutter="0"/>
+      <w:pgNumType w:start="0"/>
       <w:cols w:space="708"/>
+      <w:titlePg/>
       <w:docGrid w:linePitch="360"/>
     </w:sectPr>
   </w:body>
 </w:document>
+</file>
+
+<file path=word/numbering.xml><?xml version="1.0" encoding="utf-8"?>
+<w:numbering xmlns:wpc="http://schemas.microsoft.com/office/word/2010/wordprocessingCanvas" xmlns:cx="http://schemas.microsoft.com/office/drawing/2014/chartex" xmlns:cx1="http://schemas.microsoft.com/office/drawing/2015/9/8/chartex" xmlns:cx2="http://schemas.microsoft.com/office/drawing/2015/10/21/chartex" xmlns:cx3="http://schemas.microsoft.com/office/drawing/2016/5/9/chartex" xmlns:cx4="http://schemas.microsoft.com/office/drawing/2016/5/10/chartex" xmlns:cx5="http://schemas.microsoft.com/office/drawing/2016/5/11/chartex" xmlns:cx6="http://schemas.microsoft.com/office/drawing/2016/5/12/chartex" xmlns:cx7="http://schemas.microsoft.com/office/drawing/2016/5/13/chartex" xmlns:cx8="http://schemas.microsoft.com/office/drawing/2016/5/14/chartex" xmlns:mc="http://schemas.openxmlformats.org/markup-compatibility/2006" xmlns:aink="http://schemas.microsoft.com/office/drawing/2016/ink" xmlns:am3d="http://schemas.microsoft.com/office/drawing/2017/model3d" xmlns:o="urn:schemas-microsoft-com:office:office" xmlns:oel="http://schemas.microsoft.com/office/2019/extlst" xmlns:r="http://schemas.openxmlformats.org/officeDocument/2006/relationships" xmlns:m="http://schemas.openxmlformats.org/officeDocument/2006/math" xmlns:v="urn:schemas-microsoft-com:vml" xmlns:wp14="http://schemas.microsoft.com/office/word/2010/wordprocessingDrawing" xmlns:wp="http://schemas.openxmlformats.org/drawingml/2006/wordprocessingDrawing" xmlns:w10="urn:schemas-microsoft-com:office:word" xmlns:w="http://schemas.openxmlformats.org/wordprocessingml/2006/main" xmlns:w14="http://schemas.microsoft.com/office/word/2010/wordml" xmlns:w15="http://schemas.microsoft.com/office/word/2012/wordml" xmlns:w16cex="http://schemas.microsoft.com/office/word/2018/wordml/cex" xmlns:w16cid="http://schemas.microsoft.com/office/word/2016/wordml/cid" xmlns:w16="http://schemas.microsoft.com/office/word/2018/wordml" xmlns:w16du="http://schemas.microsoft.com/office/word/2023/wordml/word16du" xmlns:w16sdtdh="http://schemas.microsoft.com/office/word/2020/wordml/sdtdatahash" xmlns:w16sdtfl="http://schemas.microsoft.com/office/word/2024/wordml/sdtformatlock" xmlns:w16se="http://schemas.microsoft.com/office/word/2015/wordml/symex" xmlns:wpg="http://schemas.microsoft.com/office/word/2010/wordprocessingGroup" xmlns:wpi="http://schemas.microsoft.com/office/word/2010/wordprocessingInk" xmlns:wne="http://schemas.microsoft.com/office/word/2006/wordml" xmlns:wps="http://schemas.microsoft.com/office/word/2010/wordprocessingShape" mc:Ignorable="w14 w15 w16se w16cid w16 w16cex w16sdtdh w16sdtfl w16du wp14">
+  <w:abstractNum w:abstractNumId="0" w15:restartNumberingAfterBreak="0">
+    <w:nsid w:val="52A30EE8"/>
+    <w:multiLevelType w:val="hybridMultilevel"/>
+    <w:tmpl w:val="0F44DEA6"/>
+    <w:lvl w:ilvl="0" w:tplc="0680A23E">
+      <w:start w:val="1"/>
+      <w:numFmt w:val="bullet"/>
+      <w:lvlText w:val="•"/>
+      <w:lvlJc w:val="left"/>
+      <w:pPr>
+        <w:ind w:left="540" w:hanging="270"/>
+      </w:pPr>
+    </w:lvl>
+    <w:lvl w:ilvl="1" w:tplc="C7AE1808">
+      <w:numFmt w:val="decimal"/>
+      <w:lvlText w:val=""/>
+      <w:lvlJc w:val="left"/>
+      <w:pPr>
+        <w:ind w:left="0" w:firstLine="0"/>
+      </w:pPr>
+    </w:lvl>
+    <w:lvl w:ilvl="2" w:tplc="300C8EBA">
+      <w:numFmt w:val="decimal"/>
+      <w:lvlText w:val=""/>
+      <w:lvlJc w:val="left"/>
+      <w:pPr>
+        <w:ind w:left="0" w:firstLine="0"/>
+      </w:pPr>
+    </w:lvl>
+    <w:lvl w:ilvl="3" w:tplc="F378E996">
+      <w:numFmt w:val="decimal"/>
+      <w:lvlText w:val=""/>
+      <w:lvlJc w:val="left"/>
+      <w:pPr>
+        <w:ind w:left="0" w:firstLine="0"/>
+      </w:pPr>
+    </w:lvl>
+    <w:lvl w:ilvl="4" w:tplc="C302C4C6">
+      <w:numFmt w:val="decimal"/>
+      <w:lvlText w:val=""/>
+      <w:lvlJc w:val="left"/>
+      <w:pPr>
+        <w:ind w:left="0" w:firstLine="0"/>
+      </w:pPr>
+    </w:lvl>
+    <w:lvl w:ilvl="5" w:tplc="9410B66E">
+      <w:numFmt w:val="decimal"/>
+      <w:lvlText w:val=""/>
+      <w:lvlJc w:val="left"/>
+      <w:pPr>
+        <w:ind w:left="0" w:firstLine="0"/>
+      </w:pPr>
+    </w:lvl>
+    <w:lvl w:ilvl="6" w:tplc="1F7AE06E">
+      <w:numFmt w:val="decimal"/>
+      <w:lvlText w:val=""/>
+      <w:lvlJc w:val="left"/>
+      <w:pPr>
+        <w:ind w:left="0" w:firstLine="0"/>
+      </w:pPr>
+    </w:lvl>
+    <w:lvl w:ilvl="7" w:tplc="62724B7A">
+      <w:numFmt w:val="decimal"/>
+      <w:lvlText w:val=""/>
+      <w:lvlJc w:val="left"/>
+      <w:pPr>
+        <w:ind w:left="0" w:firstLine="0"/>
+      </w:pPr>
+    </w:lvl>
+    <w:lvl w:ilvl="8" w:tplc="17DEDE70">
+      <w:numFmt w:val="decimal"/>
+      <w:lvlText w:val=""/>
+      <w:lvlJc w:val="left"/>
+      <w:pPr>
+        <w:ind w:left="0" w:firstLine="0"/>
+      </w:pPr>
+    </w:lvl>
+  </w:abstractNum>
+  <w:num w:numId="1" w16cid:durableId="798839580">
+    <w:abstractNumId w:val="0"/>
+    <w:lvlOverride w:ilvl="0"/>
+    <w:lvlOverride w:ilvl="1"/>
+    <w:lvlOverride w:ilvl="2"/>
+    <w:lvlOverride w:ilvl="3"/>
+    <w:lvlOverride w:ilvl="4"/>
+    <w:lvlOverride w:ilvl="5"/>
+    <w:lvlOverride w:ilvl="6"/>
+    <w:lvlOverride w:ilvl="7"/>
+    <w:lvlOverride w:ilvl="8"/>
+  </w:num>
+</w:numbering>
 </file>
 
 <file path=word/styles.xml><?xml version="1.0" encoding="utf-8"?>
@@ -654,7 +2088,6 @@
   <w:style w:type="character" w:default="1" w:styleId="DefaultParagraphFont">
     <w:name w:val="Default Paragraph Font"/>
     <w:uiPriority w:val="1"/>
-    <w:semiHidden/>
     <w:unhideWhenUsed/>
   </w:style>
   <w:style w:type="table" w:default="1" w:styleId="TableNormal">
@@ -968,7 +2401,634 @@
       <w:spacing w:val="5"/>
     </w:rPr>
   </w:style>
+  <w:style w:type="paragraph" w:styleId="NoSpacing">
+    <w:name w:val="No Spacing"/>
+    <w:link w:val="NoSpacingChar"/>
+    <w:uiPriority w:val="1"/>
+    <w:qFormat/>
+    <w:rsid w:val="00394B45"/>
+    <w:pPr>
+      <w:spacing w:after="0" w:line="240" w:lineRule="auto"/>
+    </w:pPr>
+    <w:rPr>
+      <w:kern w:val="0"/>
+      <w:lang w:val="en-US" w:eastAsia="en-US"/>
+      <w14:ligatures w14:val="none"/>
+    </w:rPr>
+  </w:style>
+  <w:style w:type="character" w:customStyle="1" w:styleId="NoSpacingChar">
+    <w:name w:val="No Spacing Char"/>
+    <w:basedOn w:val="DefaultParagraphFont"/>
+    <w:link w:val="NoSpacing"/>
+    <w:uiPriority w:val="1"/>
+    <w:rsid w:val="00394B45"/>
+    <w:rPr>
+      <w:kern w:val="0"/>
+      <w:lang w:val="en-US" w:eastAsia="en-US"/>
+      <w14:ligatures w14:val="none"/>
+    </w:rPr>
+  </w:style>
 </w:styles>
+</file>
+
+<file path=word/glossary/document.xml><?xml version="1.0" encoding="utf-8"?>
+<w:glossaryDocument xmlns:wpc="http://schemas.microsoft.com/office/word/2010/wordprocessingCanvas" xmlns:cx="http://schemas.microsoft.com/office/drawing/2014/chartex" xmlns:cx1="http://schemas.microsoft.com/office/drawing/2015/9/8/chartex" xmlns:cx2="http://schemas.microsoft.com/office/drawing/2015/10/21/chartex" xmlns:cx3="http://schemas.microsoft.com/office/drawing/2016/5/9/chartex" xmlns:cx4="http://schemas.microsoft.com/office/drawing/2016/5/10/chartex" xmlns:cx5="http://schemas.microsoft.com/office/drawing/2016/5/11/chartex" xmlns:cx6="http://schemas.microsoft.com/office/drawing/2016/5/12/chartex" xmlns:cx7="http://schemas.microsoft.com/office/drawing/2016/5/13/chartex" xmlns:cx8="http://schemas.microsoft.com/office/drawing/2016/5/14/chartex" xmlns:mc="http://schemas.openxmlformats.org/markup-compatibility/2006" xmlns:aink="http://schemas.microsoft.com/office/drawing/2016/ink" xmlns:am3d="http://schemas.microsoft.com/office/drawing/2017/model3d" xmlns:o="urn:schemas-microsoft-com:office:office" xmlns:oel="http://schemas.microsoft.com/office/2019/extlst" xmlns:r="http://schemas.openxmlformats.org/officeDocument/2006/relationships" xmlns:m="http://schemas.openxmlformats.org/officeDocument/2006/math" xmlns:v="urn:schemas-microsoft-com:vml" xmlns:wp14="http://schemas.microsoft.com/office/word/2010/wordprocessingDrawing" xmlns:wp="http://schemas.openxmlformats.org/drawingml/2006/wordprocessingDrawing" xmlns:w10="urn:schemas-microsoft-com:office:word" xmlns:w="http://schemas.openxmlformats.org/wordprocessingml/2006/main" xmlns:w14="http://schemas.microsoft.com/office/word/2010/wordml" xmlns:w15="http://schemas.microsoft.com/office/word/2012/wordml" xmlns:w16cex="http://schemas.microsoft.com/office/word/2018/wordml/cex" xmlns:w16cid="http://schemas.microsoft.com/office/word/2016/wordml/cid" xmlns:w16="http://schemas.microsoft.com/office/word/2018/wordml" xmlns:w16du="http://schemas.microsoft.com/office/word/2023/wordml/word16du" xmlns:w16sdtdh="http://schemas.microsoft.com/office/word/2020/wordml/sdtdatahash" xmlns:w16sdtfl="http://schemas.microsoft.com/office/word/2024/wordml/sdtformatlock" xmlns:w16se="http://schemas.microsoft.com/office/word/2015/wordml/symex" xmlns:wpg="http://schemas.microsoft.com/office/word/2010/wordprocessingGroup" xmlns:wpi="http://schemas.microsoft.com/office/word/2010/wordprocessingInk" xmlns:wne="http://schemas.microsoft.com/office/word/2006/wordml" xmlns:wps="http://schemas.microsoft.com/office/word/2010/wordprocessingShape" mc:Ignorable="w14 w15 w16se w16cid w16 w16cex w16sdtdh w16sdtfl w16du wp14">
+  <w:docParts>
+    <w:docPart>
+      <w:docPartPr>
+        <w:name w:val="35EDE1D46D77471FAF011BAF829EAD7C"/>
+        <w:category>
+          <w:name w:val="General"/>
+          <w:gallery w:val="placeholder"/>
+        </w:category>
+        <w:types>
+          <w:type w:val="bbPlcHdr"/>
+        </w:types>
+        <w:behaviors>
+          <w:behavior w:val="content"/>
+        </w:behaviors>
+        <w:guid w:val="{9F1886FF-9CD4-4805-BFB3-E1BAF060550A}"/>
+      </w:docPartPr>
+      <w:docPartBody>
+        <w:p>
+          <w:pPr>
+            <w:pStyle w:val="35EDE1D46D77471FAF011BAF829EAD7C"/>
+          </w:pPr>
+          <w:r>
+            <w:rPr>
+              <w:rFonts w:asciiTheme="majorHAnsi" w:eastAsiaTheme="majorEastAsia" w:hAnsiTheme="majorHAnsi" w:cstheme="majorBidi"/>
+              <w:caps/>
+              <w:color w:val="4472C4" w:themeColor="accent1"/>
+              <w:sz w:val="80"/>
+              <w:szCs w:val="80"/>
+            </w:rPr>
+            <w:t>[Document title]</w:t>
+          </w:r>
+        </w:p>
+      </w:docPartBody>
+    </w:docPart>
+    <w:docPart>
+      <w:docPartPr>
+        <w:name w:val="B19AD2CAABA043BFBE5996EA118F6218"/>
+        <w:category>
+          <w:name w:val="General"/>
+          <w:gallery w:val="placeholder"/>
+        </w:category>
+        <w:types>
+          <w:type w:val="bbPlcHdr"/>
+        </w:types>
+        <w:behaviors>
+          <w:behavior w:val="content"/>
+        </w:behaviors>
+        <w:guid w:val="{9174234C-8E3D-4C7B-918F-6CB9C8387257}"/>
+      </w:docPartPr>
+      <w:docPartBody>
+        <w:p>
+          <w:pPr>
+            <w:pStyle w:val="B19AD2CAABA043BFBE5996EA118F6218"/>
+          </w:pPr>
+          <w:r>
+            <w:rPr>
+              <w:color w:val="4472C4" w:themeColor="accent1"/>
+              <w:sz w:val="28"/>
+              <w:szCs w:val="28"/>
+            </w:rPr>
+            <w:t>[Document subtitle]</w:t>
+          </w:r>
+        </w:p>
+      </w:docPartBody>
+    </w:docPart>
+  </w:docParts>
+</w:glossaryDocument>
+</file>
+
+<file path=word/glossary/fontTable.xml><?xml version="1.0" encoding="utf-8"?>
+<w:fonts xmlns:mc="http://schemas.openxmlformats.org/markup-compatibility/2006" xmlns:r="http://schemas.openxmlformats.org/officeDocument/2006/relationships" xmlns:w="http://schemas.openxmlformats.org/wordprocessingml/2006/main" xmlns:w14="http://schemas.microsoft.com/office/word/2010/wordml" xmlns:w15="http://schemas.microsoft.com/office/word/2012/wordml" xmlns:w16cex="http://schemas.microsoft.com/office/word/2018/wordml/cex" xmlns:w16cid="http://schemas.microsoft.com/office/word/2016/wordml/cid" xmlns:w16="http://schemas.microsoft.com/office/word/2018/wordml" xmlns:w16du="http://schemas.microsoft.com/office/word/2023/wordml/word16du" xmlns:w16sdtdh="http://schemas.microsoft.com/office/word/2020/wordml/sdtdatahash" xmlns:w16sdtfl="http://schemas.microsoft.com/office/word/2024/wordml/sdtformatlock" xmlns:w16se="http://schemas.microsoft.com/office/word/2015/wordml/symex" mc:Ignorable="w14 w15 w16se w16cid w16 w16cex w16sdtdh w16sdtfl w16du">
+  <w:font w:name="Times New Roman">
+    <w:panose1 w:val="02020603050405020304"/>
+    <w:charset w:val="00"/>
+    <w:family w:val="roman"/>
+    <w:pitch w:val="variable"/>
+    <w:sig w:usb0="E0002EFF" w:usb1="C000785B" w:usb2="00000009" w:usb3="00000000" w:csb0="000001FF" w:csb1="00000000"/>
+  </w:font>
+  <w:font w:name="Calibri">
+    <w:panose1 w:val="020F0502020204030204"/>
+    <w:charset w:val="00"/>
+    <w:family w:val="swiss"/>
+    <w:pitch w:val="variable"/>
+    <w:sig w:usb0="E4002EFF" w:usb1="C200247B" w:usb2="00000009" w:usb3="00000000" w:csb0="000001FF" w:csb1="00000000"/>
+  </w:font>
+  <w:font w:name="DengXian">
+    <w:altName w:val="等线"/>
+    <w:panose1 w:val="02010600030101010101"/>
+    <w:charset w:val="86"/>
+    <w:family w:val="auto"/>
+    <w:pitch w:val="variable"/>
+    <w:sig w:usb0="A00002BF" w:usb1="38CF7CFA" w:usb2="00000016" w:usb3="00000000" w:csb0="0004000F" w:csb1="00000000"/>
+  </w:font>
+  <w:font w:name="Calibri Light">
+    <w:panose1 w:val="020F0302020204030204"/>
+    <w:charset w:val="00"/>
+    <w:family w:val="swiss"/>
+    <w:pitch w:val="variable"/>
+    <w:sig w:usb0="E4002EFF" w:usb1="C200247B" w:usb2="00000009" w:usb3="00000000" w:csb0="000001FF" w:csb1="00000000"/>
+  </w:font>
+  <w:font w:name="DengXian Light">
+    <w:altName w:val="等线 Light"/>
+    <w:panose1 w:val="02010600030101010101"/>
+    <w:charset w:val="86"/>
+    <w:family w:val="auto"/>
+    <w:pitch w:val="variable"/>
+    <w:sig w:usb0="A00002BF" w:usb1="38CF7CFA" w:usb2="00000016" w:usb3="00000000" w:csb0="0004000F" w:csb1="00000000"/>
+  </w:font>
+</w:fonts>
+</file>
+
+<file path=word/glossary/settings.xml><?xml version="1.0" encoding="utf-8"?>
+<w:settings xmlns:mc="http://schemas.openxmlformats.org/markup-compatibility/2006" xmlns:o="urn:schemas-microsoft-com:office:office" xmlns:r="http://schemas.openxmlformats.org/officeDocument/2006/relationships" xmlns:m="http://schemas.openxmlformats.org/officeDocument/2006/math" xmlns:v="urn:schemas-microsoft-com:vml" xmlns:w10="urn:schemas-microsoft-com:office:word" xmlns:w="http://schemas.openxmlformats.org/wordprocessingml/2006/main" xmlns:w14="http://schemas.microsoft.com/office/word/2010/wordml" xmlns:w15="http://schemas.microsoft.com/office/word/2012/wordml" xmlns:w16cex="http://schemas.microsoft.com/office/word/2018/wordml/cex" xmlns:w16cid="http://schemas.microsoft.com/office/word/2016/wordml/cid" xmlns:w16="http://schemas.microsoft.com/office/word/2018/wordml" xmlns:w16du="http://schemas.microsoft.com/office/word/2023/wordml/word16du" xmlns:w16sdtdh="http://schemas.microsoft.com/office/word/2020/wordml/sdtdatahash" xmlns:w16sdtfl="http://schemas.microsoft.com/office/word/2024/wordml/sdtformatlock" xmlns:w16se="http://schemas.microsoft.com/office/word/2015/wordml/symex" xmlns:sl="http://schemas.openxmlformats.org/schemaLibrary/2006/main" mc:Ignorable="w14 w15 w16se w16cid w16 w16cex w16sdtdh w16sdtfl w16du">
+  <w:view w:val="normal"/>
+  <w:defaultTabStop w:val="720"/>
+  <w:characterSpacingControl w:val="doNotCompress"/>
+  <w:compat>
+    <w:useFELayout/>
+    <w:compatSetting w:name="compatibilityMode" w:uri="http://schemas.microsoft.com/office/word" w:val="15"/>
+    <w:compatSetting w:name="overrideTableStyleFontSizeAndJustification" w:uri="http://schemas.microsoft.com/office/word" w:val="1"/>
+    <w:compatSetting w:name="enableOpenTypeFeatures" w:uri="http://schemas.microsoft.com/office/word" w:val="1"/>
+    <w:compatSetting w:name="doNotFlipMirrorIndents" w:uri="http://schemas.microsoft.com/office/word" w:val="1"/>
+    <w:compatSetting w:name="differentiateMultirowTableHeaders" w:uri="http://schemas.microsoft.com/office/word" w:val="1"/>
+    <w:compatSetting w:name="useWord2013TrackBottomHyphenation" w:uri="http://schemas.microsoft.com/office/word" w:val="0"/>
+  </w:compat>
+  <w:rsids>
+    <w:rsidRoot w:val="00D700D3"/>
+    <w:rsid w:val="00177364"/>
+    <w:rsid w:val="001D269D"/>
+    <w:rsid w:val="00D700D3"/>
+  </w:rsids>
+  <m:mathPr>
+    <m:mathFont m:val="Cambria Math"/>
+    <m:brkBin m:val="before"/>
+    <m:brkBinSub m:val="--"/>
+    <m:smallFrac m:val="0"/>
+    <m:dispDef/>
+    <m:lMargin m:val="0"/>
+    <m:rMargin m:val="0"/>
+    <m:defJc m:val="centerGroup"/>
+    <m:wrapIndent m:val="1440"/>
+    <m:intLim m:val="subSup"/>
+    <m:naryLim m:val="undOvr"/>
+  </m:mathPr>
+  <w:themeFontLang w:val="en-PK" w:eastAsia="zh-CN"/>
+  <w:clrSchemeMapping w:bg1="light1" w:t1="dark1" w:bg2="light2" w:t2="dark2" w:accent1="accent1" w:accent2="accent2" w:accent3="accent3" w:accent4="accent4" w:accent5="accent5" w:accent6="accent6" w:hyperlink="hyperlink" w:followedHyperlink="followedHyperlink"/>
+  <w:decimalSymbol w:val="."/>
+  <w:listSeparator w:val=","/>
+  <w15:chartTrackingRefBased/>
+</w:settings>
+</file>
+
+<file path=word/glossary/styles.xml><?xml version="1.0" encoding="utf-8"?>
+<w:styles xmlns:mc="http://schemas.openxmlformats.org/markup-compatibility/2006" xmlns:r="http://schemas.openxmlformats.org/officeDocument/2006/relationships" xmlns:w="http://schemas.openxmlformats.org/wordprocessingml/2006/main" xmlns:w14="http://schemas.microsoft.com/office/word/2010/wordml" xmlns:w15="http://schemas.microsoft.com/office/word/2012/wordml" xmlns:w16cex="http://schemas.microsoft.com/office/word/2018/wordml/cex" xmlns:w16cid="http://schemas.microsoft.com/office/word/2016/wordml/cid" xmlns:w16="http://schemas.microsoft.com/office/word/2018/wordml" xmlns:w16du="http://schemas.microsoft.com/office/word/2023/wordml/word16du" xmlns:w16sdtdh="http://schemas.microsoft.com/office/word/2020/wordml/sdtdatahash" xmlns:w16sdtfl="http://schemas.microsoft.com/office/word/2024/wordml/sdtformatlock" xmlns:w16se="http://schemas.microsoft.com/office/word/2015/wordml/symex" mc:Ignorable="w14 w15 w16se w16cid w16 w16cex w16sdtdh w16sdtfl w16du">
+  <w:docDefaults>
+    <w:rPrDefault>
+      <w:rPr>
+        <w:rFonts w:asciiTheme="minorHAnsi" w:eastAsiaTheme="minorEastAsia" w:hAnsiTheme="minorHAnsi" w:cstheme="minorBidi"/>
+        <w:kern w:val="2"/>
+        <w:sz w:val="24"/>
+        <w:szCs w:val="24"/>
+        <w:lang w:val="en-PK" w:eastAsia="zh-CN" w:bidi="ar-SA"/>
+        <w14:ligatures w14:val="standardContextual"/>
+      </w:rPr>
+    </w:rPrDefault>
+    <w:pPrDefault>
+      <w:pPr>
+        <w:spacing w:after="160" w:line="278" w:lineRule="auto"/>
+      </w:pPr>
+    </w:pPrDefault>
+  </w:docDefaults>
+  <w:latentStyles w:defLockedState="0" w:defUIPriority="99" w:defSemiHidden="0" w:defUnhideWhenUsed="0" w:defQFormat="0" w:count="376">
+    <w:lsdException w:name="Normal" w:uiPriority="0" w:qFormat="1"/>
+    <w:lsdException w:name="heading 1" w:uiPriority="9" w:qFormat="1"/>
+    <w:lsdException w:name="heading 2" w:semiHidden="1" w:uiPriority="9" w:unhideWhenUsed="1" w:qFormat="1"/>
+    <w:lsdException w:name="heading 3" w:semiHidden="1" w:uiPriority="9" w:unhideWhenUsed="1" w:qFormat="1"/>
+    <w:lsdException w:name="heading 4" w:semiHidden="1" w:uiPriority="9" w:unhideWhenUsed="1" w:qFormat="1"/>
+    <w:lsdException w:name="heading 5" w:semiHidden="1" w:uiPriority="9" w:unhideWhenUsed="1" w:qFormat="1"/>
+    <w:lsdException w:name="heading 6" w:semiHidden="1" w:uiPriority="9" w:unhideWhenUsed="1" w:qFormat="1"/>
+    <w:lsdException w:name="heading 7" w:semiHidden="1" w:uiPriority="9" w:unhideWhenUsed="1" w:qFormat="1"/>
+    <w:lsdException w:name="heading 8" w:semiHidden="1" w:uiPriority="9" w:unhideWhenUsed="1" w:qFormat="1"/>
+    <w:lsdException w:name="heading 9" w:semiHidden="1" w:uiPriority="9" w:unhideWhenUsed="1" w:qFormat="1"/>
+    <w:lsdException w:name="index 1" w:semiHidden="1" w:unhideWhenUsed="1"/>
+    <w:lsdException w:name="index 2" w:semiHidden="1" w:unhideWhenUsed="1"/>
+    <w:lsdException w:name="index 3" w:semiHidden="1" w:unhideWhenUsed="1"/>
+    <w:lsdException w:name="index 4" w:semiHidden="1" w:unhideWhenUsed="1"/>
+    <w:lsdException w:name="index 5" w:semiHidden="1" w:unhideWhenUsed="1"/>
+    <w:lsdException w:name="index 6" w:semiHidden="1" w:unhideWhenUsed="1"/>
+    <w:lsdException w:name="index 7" w:semiHidden="1" w:unhideWhenUsed="1"/>
+    <w:lsdException w:name="index 8" w:semiHidden="1" w:unhideWhenUsed="1"/>
+    <w:lsdException w:name="index 9" w:semiHidden="1" w:unhideWhenUsed="1"/>
+    <w:lsdException w:name="toc 1" w:semiHidden="1" w:uiPriority="39" w:unhideWhenUsed="1"/>
+    <w:lsdException w:name="toc 2" w:semiHidden="1" w:uiPriority="39" w:unhideWhenUsed="1"/>
+    <w:lsdException w:name="toc 3" w:semiHidden="1" w:uiPriority="39" w:unhideWhenUsed="1"/>
+    <w:lsdException w:name="toc 4" w:semiHidden="1" w:uiPriority="39" w:unhideWhenUsed="1"/>
+    <w:lsdException w:name="toc 5" w:semiHidden="1" w:uiPriority="39" w:unhideWhenUsed="1"/>
+    <w:lsdException w:name="toc 6" w:semiHidden="1" w:uiPriority="39" w:unhideWhenUsed="1"/>
+    <w:lsdException w:name="toc 7" w:semiHidden="1" w:uiPriority="39" w:unhideWhenUsed="1"/>
+    <w:lsdException w:name="toc 8" w:semiHidden="1" w:uiPriority="39" w:unhideWhenUsed="1"/>
+    <w:lsdException w:name="toc 9" w:semiHidden="1" w:uiPriority="39" w:unhideWhenUsed="1"/>
+    <w:lsdException w:name="Normal Indent" w:semiHidden="1" w:unhideWhenUsed="1"/>
+    <w:lsdException w:name="footnote text" w:semiHidden="1" w:unhideWhenUsed="1"/>
+    <w:lsdException w:name="annotation text" w:semiHidden="1" w:unhideWhenUsed="1"/>
+    <w:lsdException w:name="header" w:semiHidden="1" w:unhideWhenUsed="1"/>
+    <w:lsdException w:name="footer" w:semiHidden="1" w:unhideWhenUsed="1"/>
+    <w:lsdException w:name="index heading" w:semiHidden="1" w:unhideWhenUsed="1"/>
+    <w:lsdException w:name="caption" w:semiHidden="1" w:uiPriority="35" w:unhideWhenUsed="1" w:qFormat="1"/>
+    <w:lsdException w:name="table of figures" w:semiHidden="1" w:unhideWhenUsed="1"/>
+    <w:lsdException w:name="envelope address" w:semiHidden="1" w:unhideWhenUsed="1"/>
+    <w:lsdException w:name="envelope return" w:semiHidden="1" w:unhideWhenUsed="1"/>
+    <w:lsdException w:name="footnote reference" w:semiHidden="1" w:unhideWhenUsed="1"/>
+    <w:lsdException w:name="annotation reference" w:semiHidden="1" w:unhideWhenUsed="1"/>
+    <w:lsdException w:name="line number" w:semiHidden="1" w:unhideWhenUsed="1"/>
+    <w:lsdException w:name="page number" w:semiHidden="1" w:unhideWhenUsed="1"/>
+    <w:lsdException w:name="endnote reference" w:semiHidden="1" w:unhideWhenUsed="1"/>
+    <w:lsdException w:name="endnote text" w:semiHidden="1" w:unhideWhenUsed="1"/>
+    <w:lsdException w:name="table of authorities" w:semiHidden="1" w:unhideWhenUsed="1"/>
+    <w:lsdException w:name="macro" w:semiHidden="1" w:unhideWhenUsed="1"/>
+    <w:lsdException w:name="toa heading" w:semiHidden="1" w:unhideWhenUsed="1"/>
+    <w:lsdException w:name="List" w:semiHidden="1" w:unhideWhenUsed="1"/>
+    <w:lsdException w:name="List Bullet" w:semiHidden="1" w:unhideWhenUsed="1"/>
+    <w:lsdException w:name="List Number" w:semiHidden="1" w:unhideWhenUsed="1"/>
+    <w:lsdException w:name="List 2" w:semiHidden="1" w:unhideWhenUsed="1"/>
+    <w:lsdException w:name="List 3" w:semiHidden="1" w:unhideWhenUsed="1"/>
+    <w:lsdException w:name="List 4" w:semiHidden="1" w:unhideWhenUsed="1"/>
+    <w:lsdException w:name="List 5" w:semiHidden="1" w:unhideWhenUsed="1"/>
+    <w:lsdException w:name="List Bullet 2" w:semiHidden="1" w:unhideWhenUsed="1"/>
+    <w:lsdException w:name="List Bullet 3" w:semiHidden="1" w:unhideWhenUsed="1"/>
+    <w:lsdException w:name="List Bullet 4" w:semiHidden="1" w:unhideWhenUsed="1"/>
+    <w:lsdException w:name="List Bullet 5" w:semiHidden="1" w:unhideWhenUsed="1"/>
+    <w:lsdException w:name="List Number 2" w:semiHidden="1" w:unhideWhenUsed="1"/>
+    <w:lsdException w:name="List Number 3" w:semiHidden="1" w:unhideWhenUsed="1"/>
+    <w:lsdException w:name="List Number 4" w:semiHidden="1" w:unhideWhenUsed="1"/>
+    <w:lsdException w:name="List Number 5" w:semiHidden="1" w:unhideWhenUsed="1"/>
+    <w:lsdException w:name="Title" w:uiPriority="10" w:qFormat="1"/>
+    <w:lsdException w:name="Closing" w:semiHidden="1" w:unhideWhenUsed="1"/>
+    <w:lsdException w:name="Signature" w:semiHidden="1" w:unhideWhenUsed="1"/>
+    <w:lsdException w:name="Default Paragraph Font" w:semiHidden="1" w:uiPriority="1" w:unhideWhenUsed="1"/>
+    <w:lsdException w:name="Body Text" w:semiHidden="1" w:unhideWhenUsed="1"/>
+    <w:lsdException w:name="Body Text Indent" w:semiHidden="1" w:unhideWhenUsed="1"/>
+    <w:lsdException w:name="List Continue" w:semiHidden="1" w:unhideWhenUsed="1"/>
+    <w:lsdException w:name="List Continue 2" w:semiHidden="1" w:unhideWhenUsed="1"/>
+    <w:lsdException w:name="List Continue 3" w:semiHidden="1" w:unhideWhenUsed="1"/>
+    <w:lsdException w:name="List Continue 4" w:semiHidden="1" w:unhideWhenUsed="1"/>
+    <w:lsdException w:name="List Continue 5" w:semiHidden="1" w:unhideWhenUsed="1"/>
+    <w:lsdException w:name="Message Header" w:semiHidden="1" w:unhideWhenUsed="1"/>
+    <w:lsdException w:name="Subtitle" w:uiPriority="11" w:qFormat="1"/>
+    <w:lsdException w:name="Salutation" w:semiHidden="1" w:unhideWhenUsed="1"/>
+    <w:lsdException w:name="Date" w:semiHidden="1" w:unhideWhenUsed="1"/>
+    <w:lsdException w:name="Body Text First Indent" w:semiHidden="1" w:unhideWhenUsed="1"/>
+    <w:lsdException w:name="Body Text First Indent 2" w:semiHidden="1" w:unhideWhenUsed="1"/>
+    <w:lsdException w:name="Note Heading" w:semiHidden="1" w:unhideWhenUsed="1"/>
+    <w:lsdException w:name="Body Text 2" w:semiHidden="1" w:unhideWhenUsed="1"/>
+    <w:lsdException w:name="Body Text 3" w:semiHidden="1" w:unhideWhenUsed="1"/>
+    <w:lsdException w:name="Body Text Indent 2" w:semiHidden="1" w:unhideWhenUsed="1"/>
+    <w:lsdException w:name="Body Text Indent 3" w:semiHidden="1" w:unhideWhenUsed="1"/>
+    <w:lsdException w:name="Block Text" w:semiHidden="1" w:unhideWhenUsed="1"/>
+    <w:lsdException w:name="Hyperlink" w:semiHidden="1" w:unhideWhenUsed="1"/>
+    <w:lsdException w:name="FollowedHyperlink" w:semiHidden="1" w:unhideWhenUsed="1"/>
+    <w:lsdException w:name="Strong" w:uiPriority="22" w:qFormat="1"/>
+    <w:lsdException w:name="Emphasis" w:uiPriority="20" w:qFormat="1"/>
+    <w:lsdException w:name="Document Map" w:semiHidden="1" w:unhideWhenUsed="1"/>
+    <w:lsdException w:name="Plain Text" w:semiHidden="1" w:unhideWhenUsed="1"/>
+    <w:lsdException w:name="E-mail Signature" w:semiHidden="1" w:unhideWhenUsed="1"/>
+    <w:lsdException w:name="HTML Top of Form" w:semiHidden="1" w:unhideWhenUsed="1"/>
+    <w:lsdException w:name="HTML Bottom of Form" w:semiHidden="1" w:unhideWhenUsed="1"/>
+    <w:lsdException w:name="Normal (Web)" w:semiHidden="1" w:unhideWhenUsed="1"/>
+    <w:lsdException w:name="HTML Acronym" w:semiHidden="1" w:unhideWhenUsed="1"/>
+    <w:lsdException w:name="HTML Address" w:semiHidden="1" w:unhideWhenUsed="1"/>
+    <w:lsdException w:name="HTML Cite" w:semiHidden="1" w:unhideWhenUsed="1"/>
+    <w:lsdException w:name="HTML Code" w:semiHidden="1" w:unhideWhenUsed="1"/>
+    <w:lsdException w:name="HTML Definition" w:semiHidden="1" w:unhideWhenUsed="1"/>
+    <w:lsdException w:name="HTML Keyboard" w:semiHidden="1" w:unhideWhenUsed="1"/>
+    <w:lsdException w:name="HTML Preformatted" w:semiHidden="1" w:unhideWhenUsed="1"/>
+    <w:lsdException w:name="HTML Sample" w:semiHidden="1" w:unhideWhenUsed="1"/>
+    <w:lsdException w:name="HTML Typewriter" w:semiHidden="1" w:unhideWhenUsed="1"/>
+    <w:lsdException w:name="HTML Variable" w:semiHidden="1" w:unhideWhenUsed="1"/>
+    <w:lsdException w:name="Normal Table" w:semiHidden="1" w:unhideWhenUsed="1"/>
+    <w:lsdException w:name="annotation subject" w:semiHidden="1" w:unhideWhenUsed="1"/>
+    <w:lsdException w:name="No List" w:semiHidden="1" w:unhideWhenUsed="1"/>
+    <w:lsdException w:name="Outline List 1" w:semiHidden="1" w:unhideWhenUsed="1"/>
+    <w:lsdException w:name="Outline List 2" w:semiHidden="1" w:unhideWhenUsed="1"/>
+    <w:lsdException w:name="Outline List 3" w:semiHidden="1" w:unhideWhenUsed="1"/>
+    <w:lsdException w:name="Table Simple 1" w:semiHidden="1" w:unhideWhenUsed="1"/>
+    <w:lsdException w:name="Table Simple 2" w:semiHidden="1" w:unhideWhenUsed="1"/>
+    <w:lsdException w:name="Table Simple 3" w:semiHidden="1" w:unhideWhenUsed="1"/>
+    <w:lsdException w:name="Table Classic 1" w:semiHidden="1" w:unhideWhenUsed="1"/>
+    <w:lsdException w:name="Table Classic 2" w:semiHidden="1" w:unhideWhenUsed="1"/>
+    <w:lsdException w:name="Table Classic 3" w:semiHidden="1" w:unhideWhenUsed="1"/>
+    <w:lsdException w:name="Table Classic 4" w:semiHidden="1" w:unhideWhenUsed="1"/>
+    <w:lsdException w:name="Table Colorful 1" w:semiHidden="1" w:unhideWhenUsed="1"/>
+    <w:lsdException w:name="Table Colorful 2" w:semiHidden="1" w:unhideWhenUsed="1"/>
+    <w:lsdException w:name="Table Colorful 3" w:semiHidden="1" w:unhideWhenUsed="1"/>
+    <w:lsdException w:name="Table Columns 1" w:semiHidden="1" w:unhideWhenUsed="1"/>
+    <w:lsdException w:name="Table Columns 2" w:semiHidden="1" w:unhideWhenUsed="1"/>
+    <w:lsdException w:name="Table Columns 3" w:semiHidden="1" w:unhideWhenUsed="1"/>
+    <w:lsdException w:name="Table Columns 4" w:semiHidden="1" w:unhideWhenUsed="1"/>
+    <w:lsdException w:name="Table Columns 5" w:semiHidden="1" w:unhideWhenUsed="1"/>
+    <w:lsdException w:name="Table Grid 1" w:semiHidden="1" w:unhideWhenUsed="1"/>
+    <w:lsdException w:name="Table Grid 2" w:semiHidden="1" w:unhideWhenUsed="1"/>
+    <w:lsdException w:name="Table Grid 3" w:semiHidden="1" w:unhideWhenUsed="1"/>
+    <w:lsdException w:name="Table Grid 4" w:semiHidden="1" w:unhideWhenUsed="1"/>
+    <w:lsdException w:name="Table Grid 5" w:semiHidden="1" w:unhideWhenUsed="1"/>
+    <w:lsdException w:name="Table Grid 6" w:semiHidden="1" w:unhideWhenUsed="1"/>
+    <w:lsdException w:name="Table Grid 7" w:semiHidden="1" w:unhideWhenUsed="1"/>
+    <w:lsdException w:name="Table Grid 8" w:semiHidden="1" w:unhideWhenUsed="1"/>
+    <w:lsdException w:name="Table List 1" w:semiHidden="1" w:unhideWhenUsed="1"/>
+    <w:lsdException w:name="Table List 2" w:semiHidden="1" w:unhideWhenUsed="1"/>
+    <w:lsdException w:name="Table List 3" w:semiHidden="1" w:unhideWhenUsed="1"/>
+    <w:lsdException w:name="Table List 4" w:semiHidden="1" w:unhideWhenUsed="1"/>
+    <w:lsdException w:name="Table List 5" w:semiHidden="1" w:unhideWhenUsed="1"/>
+    <w:lsdException w:name="Table List 6" w:semiHidden="1" w:unhideWhenUsed="1"/>
+    <w:lsdException w:name="Table List 7" w:semiHidden="1" w:unhideWhenUsed="1"/>
+    <w:lsdException w:name="Table List 8" w:semiHidden="1" w:unhideWhenUsed="1"/>
+    <w:lsdException w:name="Table 3D effects 1" w:semiHidden="1" w:unhideWhenUsed="1"/>
+    <w:lsdException w:name="Table 3D effects 2" w:semiHidden="1" w:unhideWhenUsed="1"/>
+    <w:lsdException w:name="Table 3D effects 3" w:semiHidden="1" w:unhideWhenUsed="1"/>
+    <w:lsdException w:name="Table Contemporary" w:semiHidden="1" w:unhideWhenUsed="1"/>
+    <w:lsdException w:name="Table Elegant" w:semiHidden="1" w:unhideWhenUsed="1"/>
+    <w:lsdException w:name="Table Professional" w:semiHidden="1" w:unhideWhenUsed="1"/>
+    <w:lsdException w:name="Table Subtle 1" w:semiHidden="1" w:unhideWhenUsed="1"/>
+    <w:lsdException w:name="Table Subtle 2" w:semiHidden="1" w:unhideWhenUsed="1"/>
+    <w:lsdException w:name="Table Web 1" w:semiHidden="1" w:unhideWhenUsed="1"/>
+    <w:lsdException w:name="Table Web 2" w:semiHidden="1" w:unhideWhenUsed="1"/>
+    <w:lsdException w:name="Table Web 3" w:semiHidden="1" w:unhideWhenUsed="1"/>
+    <w:lsdException w:name="Balloon Text" w:semiHidden="1" w:unhideWhenUsed="1"/>
+    <w:lsdException w:name="Table Grid" w:uiPriority="39"/>
+    <w:lsdException w:name="Table Theme" w:semiHidden="1" w:unhideWhenUsed="1"/>
+    <w:lsdException w:name="Placeholder Text" w:semiHidden="1"/>
+    <w:lsdException w:name="No Spacing" w:uiPriority="1" w:qFormat="1"/>
+    <w:lsdException w:name="Light Shading" w:uiPriority="60"/>
+    <w:lsdException w:name="Light List" w:uiPriority="61"/>
+    <w:lsdException w:name="Light Grid" w:uiPriority="62"/>
+    <w:lsdException w:name="Medium Shading 1" w:uiPriority="63"/>
+    <w:lsdException w:name="Medium Shading 2" w:uiPriority="64"/>
+    <w:lsdException w:name="Medium List 1" w:uiPriority="65"/>
+    <w:lsdException w:name="Medium List 2" w:uiPriority="66"/>
+    <w:lsdException w:name="Medium Grid 1" w:uiPriority="67"/>
+    <w:lsdException w:name="Medium Grid 2" w:uiPriority="68"/>
+    <w:lsdException w:name="Medium Grid 3" w:uiPriority="69"/>
+    <w:lsdException w:name="Dark List" w:uiPriority="70"/>
+    <w:lsdException w:name="Colorful Shading" w:uiPriority="71"/>
+    <w:lsdException w:name="Colorful List" w:uiPriority="72"/>
+    <w:lsdException w:name="Colorful Grid" w:uiPriority="73"/>
+    <w:lsdException w:name="Light Shading Accent 1" w:uiPriority="60"/>
+    <w:lsdException w:name="Light List Accent 1" w:uiPriority="61"/>
+    <w:lsdException w:name="Light Grid Accent 1" w:uiPriority="62"/>
+    <w:lsdException w:name="Medium Shading 1 Accent 1" w:uiPriority="63"/>
+    <w:lsdException w:name="Medium Shading 2 Accent 1" w:uiPriority="64"/>
+    <w:lsdException w:name="Medium List 1 Accent 1" w:uiPriority="65"/>
+    <w:lsdException w:name="Revision" w:semiHidden="1"/>
+    <w:lsdException w:name="List Paragraph" w:uiPriority="34" w:qFormat="1"/>
+    <w:lsdException w:name="Quote" w:uiPriority="29" w:qFormat="1"/>
+    <w:lsdException w:name="Intense Quote" w:uiPriority="30" w:qFormat="1"/>
+    <w:lsdException w:name="Medium List 2 Accent 1" w:uiPriority="66"/>
+    <w:lsdException w:name="Medium Grid 1 Accent 1" w:uiPriority="67"/>
+    <w:lsdException w:name="Medium Grid 2 Accent 1" w:uiPriority="68"/>
+    <w:lsdException w:name="Medium Grid 3 Accent 1" w:uiPriority="69"/>
+    <w:lsdException w:name="Dark List Accent 1" w:uiPriority="70"/>
+    <w:lsdException w:name="Colorful Shading Accent 1" w:uiPriority="71"/>
+    <w:lsdException w:name="Colorful List Accent 1" w:uiPriority="72"/>
+    <w:lsdException w:name="Colorful Grid Accent 1" w:uiPriority="73"/>
+    <w:lsdException w:name="Light Shading Accent 2" w:uiPriority="60"/>
+    <w:lsdException w:name="Light List Accent 2" w:uiPriority="61"/>
+    <w:lsdException w:name="Light Grid Accent 2" w:uiPriority="62"/>
+    <w:lsdException w:name="Medium Shading 1 Accent 2" w:uiPriority="63"/>
+    <w:lsdException w:name="Medium Shading 2 Accent 2" w:uiPriority="64"/>
+    <w:lsdException w:name="Medium List 1 Accent 2" w:uiPriority="65"/>
+    <w:lsdException w:name="Medium List 2 Accent 2" w:uiPriority="66"/>
+    <w:lsdException w:name="Medium Grid 1 Accent 2" w:uiPriority="67"/>
+    <w:lsdException w:name="Medium Grid 2 Accent 2" w:uiPriority="68"/>
+    <w:lsdException w:name="Medium Grid 3 Accent 2" w:uiPriority="69"/>
+    <w:lsdException w:name="Dark List Accent 2" w:uiPriority="70"/>
+    <w:lsdException w:name="Colorful Shading Accent 2" w:uiPriority="71"/>
+    <w:lsdException w:name="Colorful List Accent 2" w:uiPriority="72"/>
+    <w:lsdException w:name="Colorful Grid Accent 2" w:uiPriority="73"/>
+    <w:lsdException w:name="Light Shading Accent 3" w:uiPriority="60"/>
+    <w:lsdException w:name="Light List Accent 3" w:uiPriority="61"/>
+    <w:lsdException w:name="Light Grid Accent 3" w:uiPriority="62"/>
+    <w:lsdException w:name="Medium Shading 1 Accent 3" w:uiPriority="63"/>
+    <w:lsdException w:name="Medium Shading 2 Accent 3" w:uiPriority="64"/>
+    <w:lsdException w:name="Medium List 1 Accent 3" w:uiPriority="65"/>
+    <w:lsdException w:name="Medium List 2 Accent 3" w:uiPriority="66"/>
+    <w:lsdException w:name="Medium Grid 1 Accent 3" w:uiPriority="67"/>
+    <w:lsdException w:name="Medium Grid 2 Accent 3" w:uiPriority="68"/>
+    <w:lsdException w:name="Medium Grid 3 Accent 3" w:uiPriority="69"/>
+    <w:lsdException w:name="Dark List Accent 3" w:uiPriority="70"/>
+    <w:lsdException w:name="Colorful Shading Accent 3" w:uiPriority="71"/>
+    <w:lsdException w:name="Colorful List Accent 3" w:uiPriority="72"/>
+    <w:lsdException w:name="Colorful Grid Accent 3" w:uiPriority="73"/>
+    <w:lsdException w:name="Light Shading Accent 4" w:uiPriority="60"/>
+    <w:lsdException w:name="Light List Accent 4" w:uiPriority="61"/>
+    <w:lsdException w:name="Light Grid Accent 4" w:uiPriority="62"/>
+    <w:lsdException w:name="Medium Shading 1 Accent 4" w:uiPriority="63"/>
+    <w:lsdException w:name="Medium Shading 2 Accent 4" w:uiPriority="64"/>
+    <w:lsdException w:name="Medium List 1 Accent 4" w:uiPriority="65"/>
+    <w:lsdException w:name="Medium List 2 Accent 4" w:uiPriority="66"/>
+    <w:lsdException w:name="Medium Grid 1 Accent 4" w:uiPriority="67"/>
+    <w:lsdException w:name="Medium Grid 2 Accent 4" w:uiPriority="68"/>
+    <w:lsdException w:name="Medium Grid 3 Accent 4" w:uiPriority="69"/>
+    <w:lsdException w:name="Dark List Accent 4" w:uiPriority="70"/>
+    <w:lsdException w:name="Colorful Shading Accent 4" w:uiPriority="71"/>
+    <w:lsdException w:name="Colorful List Accent 4" w:uiPriority="72"/>
+    <w:lsdException w:name="Colorful Grid Accent 4" w:uiPriority="73"/>
+    <w:lsdException w:name="Light Shading Accent 5" w:uiPriority="60"/>
+    <w:lsdException w:name="Light List Accent 5" w:uiPriority="61"/>
+    <w:lsdException w:name="Light Grid Accent 5" w:uiPriority="62"/>
+    <w:lsdException w:name="Medium Shading 1 Accent 5" w:uiPriority="63"/>
+    <w:lsdException w:name="Medium Shading 2 Accent 5" w:uiPriority="64"/>
+    <w:lsdException w:name="Medium List 1 Accent 5" w:uiPriority="65"/>
+    <w:lsdException w:name="Medium List 2 Accent 5" w:uiPriority="66"/>
+    <w:lsdException w:name="Medium Grid 1 Accent 5" w:uiPriority="67"/>
+    <w:lsdException w:name="Medium Grid 2 Accent 5" w:uiPriority="68"/>
+    <w:lsdException w:name="Medium Grid 3 Accent 5" w:uiPriority="69"/>
+    <w:lsdException w:name="Dark List Accent 5" w:uiPriority="70"/>
+    <w:lsdException w:name="Colorful Shading Accent 5" w:uiPriority="71"/>
+    <w:lsdException w:name="Colorful List Accent 5" w:uiPriority="72"/>
+    <w:lsdException w:name="Colorful Grid Accent 5" w:uiPriority="73"/>
+    <w:lsdException w:name="Light Shading Accent 6" w:uiPriority="60"/>
+    <w:lsdException w:name="Light List Accent 6" w:uiPriority="61"/>
+    <w:lsdException w:name="Light Grid Accent 6" w:uiPriority="62"/>
+    <w:lsdException w:name="Medium Shading 1 Accent 6" w:uiPriority="63"/>
+    <w:lsdException w:name="Medium Shading 2 Accent 6" w:uiPriority="64"/>
+    <w:lsdException w:name="Medium List 1 Accent 6" w:uiPriority="65"/>
+    <w:lsdException w:name="Medium List 2 Accent 6" w:uiPriority="66"/>
+    <w:lsdException w:name="Medium Grid 1 Accent 6" w:uiPriority="67"/>
+    <w:lsdException w:name="Medium Grid 2 Accent 6" w:uiPriority="68"/>
+    <w:lsdException w:name="Medium Grid 3 Accent 6" w:uiPriority="69"/>
+    <w:lsdException w:name="Dark List Accent 6" w:uiPriority="70"/>
+    <w:lsdException w:name="Colorful Shading Accent 6" w:uiPriority="71"/>
+    <w:lsdException w:name="Colorful List Accent 6" w:uiPriority="72"/>
+    <w:lsdException w:name="Colorful Grid Accent 6" w:uiPriority="73"/>
+    <w:lsdException w:name="Subtle Emphasis" w:uiPriority="19" w:qFormat="1"/>
+    <w:lsdException w:name="Intense Emphasis" w:uiPriority="21" w:qFormat="1"/>
+    <w:lsdException w:name="Subtle Reference" w:uiPriority="31" w:qFormat="1"/>
+    <w:lsdException w:name="Intense Reference" w:uiPriority="32" w:qFormat="1"/>
+    <w:lsdException w:name="Book Title" w:uiPriority="33" w:qFormat="1"/>
+    <w:lsdException w:name="Bibliography" w:semiHidden="1" w:uiPriority="37" w:unhideWhenUsed="1"/>
+    <w:lsdException w:name="TOC Heading" w:semiHidden="1" w:uiPriority="39" w:unhideWhenUsed="1" w:qFormat="1"/>
+    <w:lsdException w:name="Plain Table 1" w:uiPriority="41"/>
+    <w:lsdException w:name="Plain Table 2" w:uiPriority="42"/>
+    <w:lsdException w:name="Plain Table 3" w:uiPriority="43"/>
+    <w:lsdException w:name="Plain Table 4" w:uiPriority="44"/>
+    <w:lsdException w:name="Plain Table 5" w:uiPriority="45"/>
+    <w:lsdException w:name="Grid Table Light" w:uiPriority="40"/>
+    <w:lsdException w:name="Grid Table 1 Light" w:uiPriority="46"/>
+    <w:lsdException w:name="Grid Table 2" w:uiPriority="47"/>
+    <w:lsdException w:name="Grid Table 3" w:uiPriority="48"/>
+    <w:lsdException w:name="Grid Table 4" w:uiPriority="49"/>
+    <w:lsdException w:name="Grid Table 5 Dark" w:uiPriority="50"/>
+    <w:lsdException w:name="Grid Table 6 Colorful" w:uiPriority="51"/>
+    <w:lsdException w:name="Grid Table 7 Colorful" w:uiPriority="52"/>
+    <w:lsdException w:name="Grid Table 1 Light Accent 1" w:uiPriority="46"/>
+    <w:lsdException w:name="Grid Table 2 Accent 1" w:uiPriority="47"/>
+    <w:lsdException w:name="Grid Table 3 Accent 1" w:uiPriority="48"/>
+    <w:lsdException w:name="Grid Table 4 Accent 1" w:uiPriority="49"/>
+    <w:lsdException w:name="Grid Table 5 Dark Accent 1" w:uiPriority="50"/>
+    <w:lsdException w:name="Grid Table 6 Colorful Accent 1" w:uiPriority="51"/>
+    <w:lsdException w:name="Grid Table 7 Colorful Accent 1" w:uiPriority="52"/>
+    <w:lsdException w:name="Grid Table 1 Light Accent 2" w:uiPriority="46"/>
+    <w:lsdException w:name="Grid Table 2 Accent 2" w:uiPriority="47"/>
+    <w:lsdException w:name="Grid Table 3 Accent 2" w:uiPriority="48"/>
+    <w:lsdException w:name="Grid Table 4 Accent 2" w:uiPriority="49"/>
+    <w:lsdException w:name="Grid Table 5 Dark Accent 2" w:uiPriority="50"/>
+    <w:lsdException w:name="Grid Table 6 Colorful Accent 2" w:uiPriority="51"/>
+    <w:lsdException w:name="Grid Table 7 Colorful Accent 2" w:uiPriority="52"/>
+    <w:lsdException w:name="Grid Table 1 Light Accent 3" w:uiPriority="46"/>
+    <w:lsdException w:name="Grid Table 2 Accent 3" w:uiPriority="47"/>
+    <w:lsdException w:name="Grid Table 3 Accent 3" w:uiPriority="48"/>
+    <w:lsdException w:name="Grid Table 4 Accent 3" w:uiPriority="49"/>
+    <w:lsdException w:name="Grid Table 5 Dark Accent 3" w:uiPriority="50"/>
+    <w:lsdException w:name="Grid Table 6 Colorful Accent 3" w:uiPriority="51"/>
+    <w:lsdException w:name="Grid Table 7 Colorful Accent 3" w:uiPriority="52"/>
+    <w:lsdException w:name="Grid Table 1 Light Accent 4" w:uiPriority="46"/>
+    <w:lsdException w:name="Grid Table 2 Accent 4" w:uiPriority="47"/>
+    <w:lsdException w:name="Grid Table 3 Accent 4" w:uiPriority="48"/>
+    <w:lsdException w:name="Grid Table 4 Accent 4" w:uiPriority="49"/>
+    <w:lsdException w:name="Grid Table 5 Dark Accent 4" w:uiPriority="50"/>
+    <w:lsdException w:name="Grid Table 6 Colorful Accent 4" w:uiPriority="51"/>
+    <w:lsdException w:name="Grid Table 7 Colorful Accent 4" w:uiPriority="52"/>
+    <w:lsdException w:name="Grid Table 1 Light Accent 5" w:uiPriority="46"/>
+    <w:lsdException w:name="Grid Table 2 Accent 5" w:uiPriority="47"/>
+    <w:lsdException w:name="Grid Table 3 Accent 5" w:uiPriority="48"/>
+    <w:lsdException w:name="Grid Table 4 Accent 5" w:uiPriority="49"/>
+    <w:lsdException w:name="Grid Table 5 Dark Accent 5" w:uiPriority="50"/>
+    <w:lsdException w:name="Grid Table 6 Colorful Accent 5" w:uiPriority="51"/>
+    <w:lsdException w:name="Grid Table 7 Colorful Accent 5" w:uiPriority="52"/>
+    <w:lsdException w:name="Grid Table 1 Light Accent 6" w:uiPriority="46"/>
+    <w:lsdException w:name="Grid Table 2 Accent 6" w:uiPriority="47"/>
+    <w:lsdException w:name="Grid Table 3 Accent 6" w:uiPriority="48"/>
+    <w:lsdException w:name="Grid Table 4 Accent 6" w:uiPriority="49"/>
+    <w:lsdException w:name="Grid Table 5 Dark Accent 6" w:uiPriority="50"/>
+    <w:lsdException w:name="Grid Table 6 Colorful Accent 6" w:uiPriority="51"/>
+    <w:lsdException w:name="Grid Table 7 Colorful Accent 6" w:uiPriority="52"/>
+    <w:lsdException w:name="List Table 1 Light" w:uiPriority="46"/>
+    <w:lsdException w:name="List Table 2" w:uiPriority="47"/>
+    <w:lsdException w:name="List Table 3" w:uiPriority="48"/>
+    <w:lsdException w:name="List Table 4" w:uiPriority="49"/>
+    <w:lsdException w:name="List Table 5 Dark" w:uiPriority="50"/>
+    <w:lsdException w:name="List Table 6 Colorful" w:uiPriority="51"/>
+    <w:lsdException w:name="List Table 7 Colorful" w:uiPriority="52"/>
+    <w:lsdException w:name="List Table 1 Light Accent 1" w:uiPriority="46"/>
+    <w:lsdException w:name="List Table 2 Accent 1" w:uiPriority="47"/>
+    <w:lsdException w:name="List Table 3 Accent 1" w:uiPriority="48"/>
+    <w:lsdException w:name="List Table 4 Accent 1" w:uiPriority="49"/>
+    <w:lsdException w:name="List Table 5 Dark Accent 1" w:uiPriority="50"/>
+    <w:lsdException w:name="List Table 6 Colorful Accent 1" w:uiPriority="51"/>
+    <w:lsdException w:name="List Table 7 Colorful Accent 1" w:uiPriority="52"/>
+    <w:lsdException w:name="List Table 1 Light Accent 2" w:uiPriority="46"/>
+    <w:lsdException w:name="List Table 2 Accent 2" w:uiPriority="47"/>
+    <w:lsdException w:name="List Table 3 Accent 2" w:uiPriority="48"/>
+    <w:lsdException w:name="List Table 4 Accent 2" w:uiPriority="49"/>
+    <w:lsdException w:name="List Table 5 Dark Accent 2" w:uiPriority="50"/>
+    <w:lsdException w:name="List Table 6 Colorful Accent 2" w:uiPriority="51"/>
+    <w:lsdException w:name="List Table 7 Colorful Accent 2" w:uiPriority="52"/>
+    <w:lsdException w:name="List Table 1 Light Accent 3" w:uiPriority="46"/>
+    <w:lsdException w:name="List Table 2 Accent 3" w:uiPriority="47"/>
+    <w:lsdException w:name="List Table 3 Accent 3" w:uiPriority="48"/>
+    <w:lsdException w:name="List Table 4 Accent 3" w:uiPriority="49"/>
+    <w:lsdException w:name="List Table 5 Dark Accent 3" w:uiPriority="50"/>
+    <w:lsdException w:name="List Table 6 Colorful Accent 3" w:uiPriority="51"/>
+    <w:lsdException w:name="List Table 7 Colorful Accent 3" w:uiPriority="52"/>
+    <w:lsdException w:name="List Table 1 Light Accent 4" w:uiPriority="46"/>
+    <w:lsdException w:name="List Table 2 Accent 4" w:uiPriority="47"/>
+    <w:lsdException w:name="List Table 3 Accent 4" w:uiPriority="48"/>
+    <w:lsdException w:name="List Table 4 Accent 4" w:uiPriority="49"/>
+    <w:lsdException w:name="List Table 5 Dark Accent 4" w:uiPriority="50"/>
+    <w:lsdException w:name="List Table 6 Colorful Accent 4" w:uiPriority="51"/>
+    <w:lsdException w:name="List Table 7 Colorful Accent 4" w:uiPriority="52"/>
+    <w:lsdException w:name="List Table 1 Light Accent 5" w:uiPriority="46"/>
+    <w:lsdException w:name="List Table 2 Accent 5" w:uiPriority="47"/>
+    <w:lsdException w:name="List Table 3 Accent 5" w:uiPriority="48"/>
+    <w:lsdException w:name="List Table 4 Accent 5" w:uiPriority="49"/>
+    <w:lsdException w:name="List Table 5 Dark Accent 5" w:uiPriority="50"/>
+    <w:lsdException w:name="List Table 6 Colorful Accent 5" w:uiPriority="51"/>
+    <w:lsdException w:name="List Table 7 Colorful Accent 5" w:uiPriority="52"/>
+    <w:lsdException w:name="List Table 1 Light Accent 6" w:uiPriority="46"/>
+    <w:lsdException w:name="List Table 2 Accent 6" w:uiPriority="47"/>
+    <w:lsdException w:name="List Table 3 Accent 6" w:uiPriority="48"/>
+    <w:lsdException w:name="List Table 4 Accent 6" w:uiPriority="49"/>
+    <w:lsdException w:name="List Table 5 Dark Accent 6" w:uiPriority="50"/>
+    <w:lsdException w:name="List Table 6 Colorful Accent 6" w:uiPriority="51"/>
+    <w:lsdException w:name="List Table 7 Colorful Accent 6" w:uiPriority="52"/>
+    <w:lsdException w:name="Mention" w:semiHidden="1" w:unhideWhenUsed="1"/>
+    <w:lsdException w:name="Smart Hyperlink" w:semiHidden="1" w:unhideWhenUsed="1"/>
+    <w:lsdException w:name="Hashtag" w:semiHidden="1" w:unhideWhenUsed="1"/>
+    <w:lsdException w:name="Unresolved Mention" w:semiHidden="1" w:unhideWhenUsed="1"/>
+    <w:lsdException w:name="Smart Link" w:semiHidden="1" w:unhideWhenUsed="1"/>
+  </w:latentStyles>
+  <w:style w:type="paragraph" w:default="1" w:styleId="Normal">
+    <w:name w:val="Normal"/>
+    <w:qFormat/>
+  </w:style>
+  <w:style w:type="character" w:default="1" w:styleId="DefaultParagraphFont">
+    <w:name w:val="Default Paragraph Font"/>
+    <w:uiPriority w:val="1"/>
+    <w:semiHidden/>
+    <w:unhideWhenUsed/>
+  </w:style>
+  <w:style w:type="table" w:default="1" w:styleId="TableNormal">
+    <w:name w:val="Normal Table"/>
+    <w:uiPriority w:val="99"/>
+    <w:semiHidden/>
+    <w:unhideWhenUsed/>
+    <w:tblPr>
+      <w:tblInd w:w="0" w:type="dxa"/>
+      <w:tblCellMar>
+        <w:top w:w="0" w:type="dxa"/>
+        <w:left w:w="108" w:type="dxa"/>
+        <w:bottom w:w="0" w:type="dxa"/>
+        <w:right w:w="108" w:type="dxa"/>
+      </w:tblCellMar>
+    </w:tblPr>
+  </w:style>
+  <w:style w:type="numbering" w:default="1" w:styleId="NoList">
+    <w:name w:val="No List"/>
+    <w:uiPriority w:val="99"/>
+    <w:semiHidden/>
+    <w:unhideWhenUsed/>
+  </w:style>
+  <w:style w:type="paragraph" w:customStyle="1" w:styleId="35EDE1D46D77471FAF011BAF829EAD7C">
+    <w:name w:val="35EDE1D46D77471FAF011BAF829EAD7C"/>
+    <w:rsid w:val="00D700D3"/>
+  </w:style>
+  <w:style w:type="paragraph" w:customStyle="1" w:styleId="B19AD2CAABA043BFBE5996EA118F6218">
+    <w:name w:val="B19AD2CAABA043BFBE5996EA118F6218"/>
+    <w:rsid w:val="00D700D3"/>
+  </w:style>
+</w:styles>
+</file>
+
+<file path=word/glossary/webSettings.xml><?xml version="1.0" encoding="utf-8"?>
+<w:webSettings xmlns:mc="http://schemas.openxmlformats.org/markup-compatibility/2006" xmlns:r="http://schemas.openxmlformats.org/officeDocument/2006/relationships" xmlns:w="http://schemas.openxmlformats.org/wordprocessingml/2006/main" xmlns:w14="http://schemas.microsoft.com/office/word/2010/wordml" xmlns:w15="http://schemas.microsoft.com/office/word/2012/wordml" xmlns:w16cex="http://schemas.microsoft.com/office/word/2018/wordml/cex" xmlns:w16cid="http://schemas.microsoft.com/office/word/2016/wordml/cid" xmlns:w16="http://schemas.microsoft.com/office/word/2018/wordml" xmlns:w16du="http://schemas.microsoft.com/office/word/2023/wordml/word16du" xmlns:w16sdtdh="http://schemas.microsoft.com/office/word/2020/wordml/sdtdatahash" xmlns:w16sdtfl="http://schemas.microsoft.com/office/word/2024/wordml/sdtformatlock" xmlns:w16se="http://schemas.microsoft.com/office/word/2015/wordml/symex" mc:Ignorable="w14 w15 w16se w16cid w16 w16cex w16sdtdh w16sdtfl w16du">
+  <w:optimizeForBrowser/>
+  <w:allowPNG/>
+</w:webSettings>
 </file>
 
 <file path=word/theme/theme1.xml><?xml version="1.0" encoding="utf-8"?>

</xml_diff>